<commit_message>
Ajouter les exigences non fonctionnelles
</commit_message>
<xml_diff>
--- a/Livrables/Livrable01_AnalysePreliminaire.docx
+++ b/Livrables/Livrable01_AnalysePreliminaire.docx
@@ -498,7 +498,7 @@
       <w:sdtContent>
         <w:p>
           <w:pPr>
-            <w:pStyle w:val="TOCHeading"/>
+            <w:pStyle w:val="En-ttedetabledesmatires"/>
             <w:rPr>
               <w:rFonts w:asciiTheme="minorHAnsi" w:hAnsiTheme="minorHAnsi"/>
             </w:rPr>
@@ -512,7 +512,7 @@
         </w:p>
         <w:p>
           <w:pPr>
-            <w:pStyle w:val="TOC1"/>
+            <w:pStyle w:val="TM1"/>
             <w:tabs>
               <w:tab w:val="left" w:pos="423"/>
               <w:tab w:val="right" w:pos="8630"/>
@@ -550,7 +550,7 @@
           <w:hyperlink w:anchor="_Toc221803402" w:history="1">
             <w:r>
               <w:rPr>
-                <w:rStyle w:val="Hyperlink"/>
+                <w:rStyle w:val="Hyperlien"/>
                 <w:noProof/>
               </w:rPr>
               <w:t>1.</w:t>
@@ -572,7 +572,7 @@
             </w:r>
             <w:r>
               <w:rPr>
-                <w:rStyle w:val="Hyperlink"/>
+                <w:rStyle w:val="Hyperlien"/>
                 <w:noProof/>
               </w:rPr>
               <w:t>Historique du document</w:t>
@@ -629,7 +629,7 @@
         </w:p>
         <w:p>
           <w:pPr>
-            <w:pStyle w:val="TOC1"/>
+            <w:pStyle w:val="TM1"/>
             <w:tabs>
               <w:tab w:val="left" w:pos="423"/>
               <w:tab w:val="right" w:pos="8630"/>
@@ -650,7 +650,7 @@
           <w:hyperlink w:anchor="_Toc221803403" w:history="1">
             <w:r>
               <w:rPr>
-                <w:rStyle w:val="Hyperlink"/>
+                <w:rStyle w:val="Hyperlien"/>
                 <w:noProof/>
               </w:rPr>
               <w:t>2.</w:t>
@@ -672,7 +672,7 @@
             </w:r>
             <w:r>
               <w:rPr>
-                <w:rStyle w:val="Hyperlink"/>
+                <w:rStyle w:val="Hyperlien"/>
                 <w:noProof/>
               </w:rPr>
               <w:t>Description du projet</w:t>
@@ -729,7 +729,7 @@
         </w:p>
         <w:p>
           <w:pPr>
-            <w:pStyle w:val="TOC1"/>
+            <w:pStyle w:val="TM1"/>
             <w:tabs>
               <w:tab w:val="left" w:pos="423"/>
               <w:tab w:val="right" w:pos="8630"/>
@@ -750,7 +750,7 @@
           <w:hyperlink w:anchor="_Toc221803404" w:history="1">
             <w:r>
               <w:rPr>
-                <w:rStyle w:val="Hyperlink"/>
+                <w:rStyle w:val="Hyperlien"/>
                 <w:noProof/>
               </w:rPr>
               <w:t>3.</w:t>
@@ -772,7 +772,7 @@
             </w:r>
             <w:r>
               <w:rPr>
-                <w:rStyle w:val="Hyperlink"/>
+                <w:rStyle w:val="Hyperlien"/>
                 <w:noProof/>
               </w:rPr>
               <w:t>Exigences fonctionnelles</w:t>
@@ -829,7 +829,7 @@
         </w:p>
         <w:p>
           <w:pPr>
-            <w:pStyle w:val="TOC1"/>
+            <w:pStyle w:val="TM1"/>
             <w:tabs>
               <w:tab w:val="left" w:pos="423"/>
               <w:tab w:val="right" w:pos="8630"/>
@@ -850,7 +850,7 @@
           <w:hyperlink w:anchor="_Toc221803405" w:history="1">
             <w:r>
               <w:rPr>
-                <w:rStyle w:val="Hyperlink"/>
+                <w:rStyle w:val="Hyperlien"/>
                 <w:noProof/>
               </w:rPr>
               <w:t>4.</w:t>
@@ -872,21 +872,21 @@
             </w:r>
             <w:r>
               <w:rPr>
-                <w:rStyle w:val="Hyperlink"/>
+                <w:rStyle w:val="Hyperlien"/>
                 <w:noProof/>
               </w:rPr>
               <w:t>Port</w:t>
             </w:r>
             <w:r>
               <w:rPr>
-                <w:rStyle w:val="Hyperlink"/>
+                <w:rStyle w:val="Hyperlien"/>
                 <w:noProof/>
               </w:rPr>
               <w:t>É</w:t>
             </w:r>
             <w:r>
               <w:rPr>
-                <w:rStyle w:val="Hyperlink"/>
+                <w:rStyle w:val="Hyperlien"/>
                 <w:noProof/>
               </w:rPr>
               <w:t>e</w:t>
@@ -943,7 +943,7 @@
         </w:p>
         <w:p>
           <w:pPr>
-            <w:pStyle w:val="TOC1"/>
+            <w:pStyle w:val="TM1"/>
             <w:tabs>
               <w:tab w:val="left" w:pos="423"/>
               <w:tab w:val="right" w:pos="8630"/>
@@ -964,7 +964,7 @@
           <w:hyperlink w:anchor="_Toc221803406" w:history="1">
             <w:r>
               <w:rPr>
-                <w:rStyle w:val="Hyperlink"/>
+                <w:rStyle w:val="Hyperlien"/>
                 <w:noProof/>
               </w:rPr>
               <w:t>5.</w:t>
@@ -986,7 +986,7 @@
             </w:r>
             <w:r>
               <w:rPr>
-                <w:rStyle w:val="Hyperlink"/>
+                <w:rStyle w:val="Hyperlien"/>
                 <w:noProof/>
               </w:rPr>
               <w:t>Modèle de la base de données</w:t>
@@ -1043,7 +1043,7 @@
         </w:p>
         <w:p>
           <w:pPr>
-            <w:pStyle w:val="TOC1"/>
+            <w:pStyle w:val="TM1"/>
             <w:tabs>
               <w:tab w:val="left" w:pos="423"/>
               <w:tab w:val="right" w:pos="8630"/>
@@ -1064,7 +1064,7 @@
           <w:hyperlink w:anchor="_Toc221803407" w:history="1">
             <w:r>
               <w:rPr>
-                <w:rStyle w:val="Hyperlink"/>
+                <w:rStyle w:val="Hyperlien"/>
                 <w:noProof/>
               </w:rPr>
               <w:t>6.</w:t>
@@ -1086,7 +1086,7 @@
             </w:r>
             <w:r>
               <w:rPr>
-                <w:rStyle w:val="Hyperlink"/>
+                <w:rStyle w:val="Hyperlien"/>
                 <w:noProof/>
               </w:rPr>
               <w:t>Maquettes du site Web</w:t>
@@ -1143,7 +1143,7 @@
         </w:p>
         <w:p>
           <w:pPr>
-            <w:pStyle w:val="TOC1"/>
+            <w:pStyle w:val="TM1"/>
             <w:tabs>
               <w:tab w:val="left" w:pos="423"/>
               <w:tab w:val="right" w:pos="8630"/>
@@ -1164,7 +1164,7 @@
           <w:hyperlink w:anchor="_Toc221803408" w:history="1">
             <w:r>
               <w:rPr>
-                <w:rStyle w:val="Hyperlink"/>
+                <w:rStyle w:val="Hyperlien"/>
                 <w:noProof/>
               </w:rPr>
               <w:t>7.</w:t>
@@ -1186,7 +1186,7 @@
             </w:r>
             <w:r>
               <w:rPr>
-                <w:rStyle w:val="Hyperlink"/>
+                <w:rStyle w:val="Hyperlien"/>
                 <w:noProof/>
               </w:rPr>
               <w:t>Bibliographie</w:t>
@@ -1261,7 +1261,7 @@
     </w:p>
     <w:p>
       <w:pPr>
-        <w:pStyle w:val="Heading1"/>
+        <w:pStyle w:val="Titre1"/>
         <w:numPr>
           <w:ilvl w:val="0"/>
           <w:numId w:val="1"/>
@@ -1276,6 +1276,7 @@
         <w:rPr>
           <w:rFonts w:asciiTheme="minorHAnsi" w:hAnsiTheme="minorHAnsi"/>
         </w:rPr>
+        <w:lastRenderedPageBreak/>
         <w:t>Historique du document</w:t>
       </w:r>
       <w:bookmarkEnd w:id="11"/>
@@ -1289,7 +1290,7 @@
     <w:p/>
     <w:tbl>
       <w:tblPr>
-        <w:tblStyle w:val="GridTable4-Accent5"/>
+        <w:tblStyle w:val="TableauGrille4-Accentuation5"/>
         <w:tblW w:w="0" w:type="auto"/>
         <w:tblLook w:val="04A0" w:firstRow="1" w:lastRow="0" w:firstColumn="1" w:lastColumn="0" w:noHBand="0" w:noVBand="1"/>
       </w:tblPr>
@@ -1395,7 +1396,7 @@
           </w:tcPr>
           <w:p>
             <w:pPr>
-              <w:pStyle w:val="ListParagraph"/>
+              <w:pStyle w:val="Paragraphedeliste"/>
               <w:numPr>
                 <w:ilvl w:val="0"/>
                 <w:numId w:val="6"/>
@@ -1457,7 +1458,7 @@
           </w:tcPr>
           <w:p>
             <w:pPr>
-              <w:pStyle w:val="ListParagraph"/>
+              <w:pStyle w:val="Paragraphedeliste"/>
               <w:keepNext/>
               <w:numPr>
                 <w:ilvl w:val="0"/>
@@ -1480,7 +1481,7 @@
           </w:p>
           <w:p>
             <w:pPr>
-              <w:pStyle w:val="ListParagraph"/>
+              <w:pStyle w:val="Paragraphedeliste"/>
               <w:keepNext/>
               <w:numPr>
                 <w:ilvl w:val="0"/>
@@ -1540,7 +1541,7 @@
           </w:tcPr>
           <w:p>
             <w:pPr>
-              <w:pStyle w:val="ListParagraph"/>
+              <w:pStyle w:val="Paragraphedeliste"/>
               <w:keepNext/>
               <w:numPr>
                 <w:ilvl w:val="0"/>
@@ -1557,7 +1558,7 @@
           </w:p>
           <w:p>
             <w:pPr>
-              <w:pStyle w:val="ListParagraph"/>
+              <w:pStyle w:val="Paragraphedeliste"/>
               <w:keepNext/>
               <w:numPr>
                 <w:ilvl w:val="0"/>
@@ -1571,7 +1572,7 @@
           </w:p>
           <w:p>
             <w:pPr>
-              <w:pStyle w:val="ListParagraph"/>
+              <w:pStyle w:val="Paragraphedeliste"/>
               <w:keepNext/>
               <w:numPr>
                 <w:ilvl w:val="0"/>
@@ -1619,7 +1620,7 @@
           </w:tcPr>
           <w:p>
             <w:pPr>
-              <w:pStyle w:val="ListParagraph"/>
+              <w:pStyle w:val="Paragraphedeliste"/>
               <w:keepNext/>
               <w:numPr>
                 <w:ilvl w:val="0"/>
@@ -1636,7 +1637,7 @@
           </w:p>
           <w:p>
             <w:pPr>
-              <w:pStyle w:val="ListParagraph"/>
+              <w:pStyle w:val="Paragraphedeliste"/>
               <w:keepNext/>
               <w:numPr>
                 <w:ilvl w:val="0"/>
@@ -1650,7 +1651,7 @@
           </w:p>
           <w:p>
             <w:pPr>
-              <w:pStyle w:val="ListParagraph"/>
+              <w:pStyle w:val="Paragraphedeliste"/>
               <w:keepNext/>
               <w:numPr>
                 <w:ilvl w:val="0"/>
@@ -1701,7 +1702,7 @@
           </w:tcPr>
           <w:p>
             <w:pPr>
-              <w:pStyle w:val="ListParagraph"/>
+              <w:pStyle w:val="Paragraphedeliste"/>
               <w:keepNext/>
               <w:numPr>
                 <w:ilvl w:val="0"/>
@@ -1724,7 +1725,7 @@
           </w:p>
           <w:p>
             <w:pPr>
-              <w:pStyle w:val="ListParagraph"/>
+              <w:pStyle w:val="Paragraphedeliste"/>
               <w:keepNext/>
               <w:numPr>
                 <w:ilvl w:val="0"/>
@@ -1756,7 +1757,7 @@
           </w:p>
           <w:p>
             <w:pPr>
-              <w:pStyle w:val="ListParagraph"/>
+              <w:pStyle w:val="Paragraphedeliste"/>
               <w:keepNext/>
               <w:numPr>
                 <w:ilvl w:val="0"/>
@@ -1810,7 +1811,7 @@
           </w:tcPr>
           <w:p>
             <w:pPr>
-              <w:pStyle w:val="ListParagraph"/>
+              <w:pStyle w:val="Paragraphedeliste"/>
               <w:keepNext/>
               <w:numPr>
                 <w:ilvl w:val="0"/>
@@ -1867,7 +1868,7 @@
           </w:tcPr>
           <w:p>
             <w:pPr>
-              <w:pStyle w:val="ListParagraph"/>
+              <w:pStyle w:val="Paragraphedeliste"/>
               <w:keepNext/>
               <w:numPr>
                 <w:ilvl w:val="0"/>
@@ -1890,7 +1891,7 @@
     </w:tbl>
     <w:p>
       <w:pPr>
-        <w:pStyle w:val="Caption"/>
+        <w:pStyle w:val="Lgende"/>
       </w:pPr>
       <w:r>
         <w:t xml:space="preserve">Tableau </w:t>
@@ -1934,7 +1935,7 @@
     </w:p>
     <w:p>
       <w:pPr>
-        <w:pStyle w:val="Heading1"/>
+        <w:pStyle w:val="Titre1"/>
         <w:numPr>
           <w:ilvl w:val="0"/>
           <w:numId w:val="1"/>
@@ -1942,6 +1943,7 @@
       </w:pPr>
       <w:bookmarkStart w:id="12" w:name="_Toc221803403"/>
       <w:r>
+        <w:lastRenderedPageBreak/>
         <w:t>Description du projet</w:t>
       </w:r>
       <w:bookmarkEnd w:id="12"/>
@@ -2032,7 +2034,7 @@
       </w:r>
       <w:r>
         <w:rPr>
-          <w:rStyle w:val="FootnoteReference"/>
+          <w:rStyle w:val="Appelnotedebasdep"/>
           <w:rFonts w:ascii="Calibri" w:eastAsia="Calibri" w:hAnsi="Calibri" w:cs="Calibri"/>
         </w:rPr>
         <w:footnoteReference w:id="1"/>
@@ -2110,15 +2112,20 @@
     </w:p>
     <w:p>
       <w:pPr>
-        <w:jc w:val="both"/>
         <w:rPr>
           <w:rFonts w:ascii="Calibri" w:eastAsia="Calibri" w:hAnsi="Calibri" w:cs="Calibri"/>
         </w:rPr>
       </w:pPr>
-    </w:p>
-    <w:p>
-      <w:pPr>
-        <w:pStyle w:val="Heading1"/>
+      <w:r>
+        <w:rPr>
+          <w:rFonts w:ascii="Calibri" w:eastAsia="Calibri" w:hAnsi="Calibri" w:cs="Calibri"/>
+        </w:rPr>
+        <w:br w:type="page"/>
+      </w:r>
+    </w:p>
+    <w:p>
+      <w:pPr>
+        <w:pStyle w:val="Titre1"/>
         <w:numPr>
           <w:ilvl w:val="0"/>
           <w:numId w:val="1"/>
@@ -2126,10 +2133,36 @@
       </w:pPr>
       <w:bookmarkStart w:id="13" w:name="_Toc221803404"/>
       <w:r>
+        <w:lastRenderedPageBreak/>
         <w:t>Exigences fonctionnelles</w:t>
       </w:r>
       <w:bookmarkEnd w:id="13"/>
     </w:p>
+    <w:p/>
+    <w:p>
+      <w:pPr>
+        <w:jc w:val="both"/>
+        <w:rPr>
+          <w:bCs/>
+          <w:lang w:val="fr-CA"/>
+        </w:rPr>
+      </w:pPr>
+      <w:r>
+        <w:rPr>
+          <w:bCs/>
+          <w:lang w:val="fr-CA"/>
+        </w:rPr>
+        <w:t>Les exigences fonctionnelles sont des spécifications détaillées qui définissent les actions, les comportements et les fonctionnalités qu'un système doit être capable d'exécuter pour atteindre sa fonction. Dans le contexte des logiciels et des systèmes, elles décrivent ce que le système doit faire, notamment les tâches qu'il doit accomplir, son interaction avec les utilisateurs et sa réponse aux différentes entrées ou événements. Ces exigences sont fondamentales pour garantir que le logiciel réponde aux attentes des parties prenantes et aux besoins métiers prévus.</w:t>
+      </w:r>
+      <w:r>
+        <w:rPr>
+          <w:rStyle w:val="Appelnotedebasdep"/>
+          <w:bCs/>
+          <w:lang w:val="fr-CA"/>
+        </w:rPr>
+        <w:footnoteReference w:id="2"/>
+      </w:r>
+    </w:p>
     <w:p>
       <w:pPr>
         <w:rPr>
@@ -2176,12 +2209,313 @@
     </w:p>
     <w:p>
       <w:pPr>
+        <w:jc w:val="both"/>
+        <w:rPr>
+          <w:lang w:val="fr-CA"/>
+        </w:rPr>
+      </w:pPr>
+    </w:p>
+    <w:p>
+      <w:pPr>
         <w:ind w:firstLine="708"/>
         <w:jc w:val="both"/>
         <w:rPr>
-          <w:lang w:val="fr-CA"/>
-        </w:rPr>
-      </w:pPr>
+          <w:lang w:val="fr-CA" w:bidi="fa-IR"/>
+        </w:rPr>
+      </w:pPr>
+      <w:r>
+        <w:rPr>
+          <w:lang w:val="fr-CA"/>
+        </w:rPr>
+        <w:t>3</w:t>
+      </w:r>
+      <w:r>
+        <w:rPr>
+          <w:lang w:val="fr-CA"/>
+        </w:rPr>
+        <w:t>.1.1.</w:t>
+      </w:r>
+      <w:r>
+        <w:rPr>
+          <w:lang w:val="fr-CA"/>
+        </w:rPr>
+        <w:t xml:space="preserve"> </w:t>
+      </w:r>
+      <w:r>
+        <w:rPr>
+          <w:lang w:val="fr-CA"/>
+        </w:rPr>
+        <w:t xml:space="preserve">Création et </w:t>
+      </w:r>
+      <w:r>
+        <w:rPr>
+          <w:lang w:val="fr-CA"/>
+        </w:rPr>
+        <w:t xml:space="preserve">gestion </w:t>
+      </w:r>
+      <w:r>
+        <w:rPr>
+          <w:lang w:val="fr-CA" w:bidi="fa-IR"/>
+        </w:rPr>
+        <w:t>d’un</w:t>
+      </w:r>
+      <w:r>
+        <w:rPr>
+          <w:lang w:val="fr-CA" w:bidi="fa-IR"/>
+        </w:rPr>
+        <w:t xml:space="preserve"> compte utilisateur</w:t>
+      </w:r>
+    </w:p>
+    <w:p>
+      <w:pPr>
+        <w:ind w:left="1416"/>
+        <w:jc w:val="both"/>
+        <w:rPr>
+          <w:lang w:val="fr-CA" w:bidi="fa-IR"/>
+        </w:rPr>
+      </w:pPr>
+      <w:r>
+        <w:rPr>
+          <w:lang w:val="fr-CA" w:bidi="fa-IR"/>
+        </w:rPr>
+        <w:t>3.1.1.1. Le système doit permettre à l’utilisateur de créer un compte client</w:t>
+      </w:r>
+      <w:r>
+        <w:rPr>
+          <w:lang w:val="fr-CA" w:bidi="fa-IR"/>
+        </w:rPr>
+        <w:t xml:space="preserve">. </w:t>
+      </w:r>
+      <w:r>
+        <w:rPr>
+          <w:lang w:val="fr-CA" w:bidi="fa-IR"/>
+        </w:rPr>
+        <w:t>[</w:t>
+      </w:r>
+      <w:r>
+        <w:rPr>
+          <w:lang w:val="fr-CA" w:bidi="fa-IR"/>
+        </w:rPr>
+        <w:t>Essentielle</w:t>
+      </w:r>
+      <w:r>
+        <w:rPr>
+          <w:lang w:val="fr-CA" w:bidi="fa-IR"/>
+        </w:rPr>
+        <w:t>]</w:t>
+      </w:r>
+    </w:p>
+    <w:p>
+      <w:pPr>
+        <w:ind w:left="1416"/>
+        <w:jc w:val="both"/>
+        <w:rPr>
+          <w:lang w:val="fr-CA" w:bidi="fa-IR"/>
+        </w:rPr>
+      </w:pPr>
+      <w:r>
+        <w:rPr>
+          <w:lang w:val="fr-CA" w:bidi="fa-IR"/>
+        </w:rPr>
+        <w:t xml:space="preserve">3.1.1.2. </w:t>
+      </w:r>
+      <w:r>
+        <w:rPr>
+          <w:lang w:val="fr-CA" w:bidi="fa-IR"/>
+        </w:rPr>
+        <w:t xml:space="preserve">Le système doit permettre à l’utilisateur de créer un compte </w:t>
+      </w:r>
+      <w:r>
+        <w:rPr>
+          <w:lang w:val="fr-CA" w:bidi="fa-IR"/>
+        </w:rPr>
+        <w:t>à l’aide d’une adresse courriel unique</w:t>
+      </w:r>
+      <w:r>
+        <w:rPr>
+          <w:lang w:val="fr-CA" w:bidi="fa-IR"/>
+        </w:rPr>
+        <w:t xml:space="preserve">. </w:t>
+      </w:r>
+      <w:r>
+        <w:rPr>
+          <w:lang w:val="fr-CA" w:bidi="fa-IR"/>
+        </w:rPr>
+        <w:t>[</w:t>
+      </w:r>
+      <w:r>
+        <w:rPr>
+          <w:lang w:val="fr-CA" w:bidi="fa-IR"/>
+        </w:rPr>
+        <w:t>Essentielle</w:t>
+      </w:r>
+      <w:r>
+        <w:rPr>
+          <w:lang w:val="fr-CA" w:bidi="fa-IR"/>
+        </w:rPr>
+        <w:t>]</w:t>
+      </w:r>
+      <w:r>
+        <w:rPr>
+          <w:lang w:val="fr-CA" w:bidi="fa-IR"/>
+        </w:rPr>
+        <w:t xml:space="preserve"> </w:t>
+      </w:r>
+    </w:p>
+    <w:p>
+      <w:pPr>
+        <w:ind w:left="1416"/>
+        <w:jc w:val="both"/>
+        <w:rPr>
+          <w:lang w:val="fr-CA" w:bidi="fa-IR"/>
+        </w:rPr>
+      </w:pPr>
+      <w:r>
+        <w:rPr>
+          <w:lang w:val="fr-CA" w:bidi="fa-IR"/>
+        </w:rPr>
+        <w:t xml:space="preserve">3.1.1.3. </w:t>
+      </w:r>
+      <w:r>
+        <w:rPr>
+          <w:lang w:val="fr-CA" w:bidi="fa-IR"/>
+        </w:rPr>
+        <w:t>Le système doit permettre à l’utilisateur de créer un compte avec un mot de passe sécurisé</w:t>
+      </w:r>
+      <w:r>
+        <w:rPr>
+          <w:lang w:val="fr-CA" w:bidi="fa-IR"/>
+        </w:rPr>
+        <w:t xml:space="preserve">. </w:t>
+      </w:r>
+      <w:r>
+        <w:rPr>
+          <w:lang w:val="fr-CA" w:bidi="fa-IR"/>
+        </w:rPr>
+        <w:t>[</w:t>
+      </w:r>
+      <w:r>
+        <w:rPr>
+          <w:lang w:val="fr-CA" w:bidi="fa-IR"/>
+        </w:rPr>
+        <w:t>Essentielle</w:t>
+      </w:r>
+      <w:r>
+        <w:rPr>
+          <w:lang w:val="fr-CA" w:bidi="fa-IR"/>
+        </w:rPr>
+        <w:t>]</w:t>
+      </w:r>
+    </w:p>
+    <w:p>
+      <w:pPr>
+        <w:ind w:left="1416"/>
+        <w:jc w:val="both"/>
+        <w:rPr>
+          <w:lang w:val="fr-CA" w:bidi="fa-IR"/>
+        </w:rPr>
+      </w:pPr>
+      <w:r>
+        <w:rPr>
+          <w:lang w:val="fr-CA" w:bidi="fa-IR"/>
+        </w:rPr>
+        <w:t xml:space="preserve">3.1.1.4. Le système doit permettre à l’utilisateur de se connecter à son </w:t>
+      </w:r>
+      <w:r>
+        <w:rPr>
+          <w:lang w:val="fr-CA" w:bidi="fa-IR"/>
+        </w:rPr>
+        <w:t xml:space="preserve">compte à l’aide de son courriel </w:t>
+      </w:r>
+      <w:r>
+        <w:rPr>
+          <w:lang w:val="fr-CA" w:bidi="fa-IR"/>
+        </w:rPr>
+        <w:t>et de son mot de passe.</w:t>
+      </w:r>
+      <w:r>
+        <w:rPr>
+          <w:lang w:val="fr-CA" w:bidi="fa-IR"/>
+        </w:rPr>
+        <w:t xml:space="preserve"> </w:t>
+      </w:r>
+      <w:r>
+        <w:rPr>
+          <w:lang w:val="fr-CA" w:bidi="fa-IR"/>
+        </w:rPr>
+        <w:t>[</w:t>
+      </w:r>
+      <w:r>
+        <w:rPr>
+          <w:lang w:val="fr-CA" w:bidi="fa-IR"/>
+        </w:rPr>
+        <w:t>Essentielle</w:t>
+      </w:r>
+      <w:r>
+        <w:rPr>
+          <w:lang w:val="fr-CA" w:bidi="fa-IR"/>
+        </w:rPr>
+        <w:t>]</w:t>
+      </w:r>
+    </w:p>
+    <w:p>
+      <w:pPr>
+        <w:ind w:left="1416"/>
+        <w:jc w:val="both"/>
+        <w:rPr>
+          <w:lang w:val="fr-CA" w:bidi="fa-IR"/>
+        </w:rPr>
+      </w:pPr>
+      <w:r>
+        <w:rPr>
+          <w:lang w:val="fr-CA" w:bidi="fa-IR"/>
+        </w:rPr>
+        <w:t xml:space="preserve">3.1.1.5. Le système doit permettre à l’utilisateur de se </w:t>
+      </w:r>
+      <w:r>
+        <w:rPr>
+          <w:lang w:val="fr-CA" w:bidi="fa-IR"/>
+        </w:rPr>
+        <w:t xml:space="preserve">déconnecter de son compte. </w:t>
+      </w:r>
+      <w:r>
+        <w:rPr>
+          <w:lang w:val="fr-CA" w:bidi="fa-IR"/>
+        </w:rPr>
+        <w:t>[</w:t>
+      </w:r>
+      <w:r>
+        <w:rPr>
+          <w:lang w:val="fr-CA" w:bidi="fa-IR"/>
+        </w:rPr>
+        <w:t>Essentielle</w:t>
+      </w:r>
+      <w:r>
+        <w:rPr>
+          <w:lang w:val="fr-CA" w:bidi="fa-IR"/>
+        </w:rPr>
+        <w:t>]</w:t>
+      </w:r>
+      <w:r>
+        <w:rPr>
+          <w:lang w:val="fr-CA" w:bidi="fa-IR"/>
+        </w:rPr>
+        <w:t xml:space="preserve"> </w:t>
+      </w:r>
+    </w:p>
+    <w:p>
+      <w:pPr>
+        <w:jc w:val="both"/>
+        <w:rPr>
+          <w:lang w:val="fr-CA" w:bidi="fa-IR"/>
+        </w:rPr>
+      </w:pPr>
+      <w:r>
+        <w:rPr>
+          <w:lang w:val="fr-CA" w:bidi="fa-IR"/>
+        </w:rPr>
+        <w:tab/>
+      </w:r>
     </w:p>
     <w:p>
       <w:pPr>
@@ -2193,60 +2527,48 @@
       </w:pPr>
       <w:r>
         <w:rPr>
-          <w:lang w:val="fr-CA"/>
-        </w:rPr>
-        <w:t>3</w:t>
-      </w:r>
-      <w:r>
-        <w:rPr>
-          <w:lang w:val="fr-CA"/>
-        </w:rPr>
-        <w:t>.1.1.</w:t>
-      </w:r>
-      <w:r>
-        <w:rPr>
-          <w:lang w:val="fr-CA"/>
+          <w:lang w:val="fr-CA" w:bidi="fa-IR"/>
+        </w:rPr>
+        <w:t xml:space="preserve">3.1.2. </w:t>
+      </w:r>
+      <w:r>
+        <w:rPr>
+          <w:lang w:val="fr-CA" w:bidi="fa-IR"/>
+        </w:rPr>
+        <w:t>Consultation et recherche de produit</w:t>
+      </w:r>
+    </w:p>
+    <w:p>
+      <w:pPr>
+        <w:ind w:left="1416" w:firstLine="2"/>
+        <w:jc w:val="both"/>
+        <w:rPr>
+          <w:lang w:val="fr-CA" w:bidi="fa-IR"/>
+        </w:rPr>
+      </w:pPr>
+      <w:r>
+        <w:rPr>
+          <w:lang w:val="fr-CA" w:bidi="fa-IR"/>
+        </w:rPr>
+        <w:t xml:space="preserve">3.1.2.1. Le système doit permettre à l’utilisateur de </w:t>
+      </w:r>
+      <w:r>
+        <w:rPr>
+          <w:lang w:val="fr-CA" w:bidi="fa-IR"/>
+        </w:rPr>
+        <w:t>consulter la liste des ordinateurs</w:t>
+      </w:r>
+      <w:r>
+        <w:rPr>
+          <w:lang w:val="fr-CA" w:bidi="fa-IR"/>
         </w:rPr>
         <w:t xml:space="preserve"> </w:t>
       </w:r>
       <w:r>
         <w:rPr>
-          <w:lang w:val="fr-CA"/>
-        </w:rPr>
-        <w:t xml:space="preserve">Création et </w:t>
-      </w:r>
-      <w:r>
-        <w:rPr>
-          <w:lang w:val="fr-CA"/>
-        </w:rPr>
-        <w:t xml:space="preserve">gestion </w:t>
-      </w:r>
-      <w:r>
-        <w:rPr>
-          <w:lang w:val="fr-CA" w:bidi="fa-IR"/>
-        </w:rPr>
-        <w:t>d’un</w:t>
-      </w:r>
-      <w:r>
-        <w:rPr>
-          <w:lang w:val="fr-CA" w:bidi="fa-IR"/>
-        </w:rPr>
-        <w:t xml:space="preserve"> compte utilisateur</w:t>
-      </w:r>
-    </w:p>
-    <w:p>
-      <w:pPr>
-        <w:ind w:left="1416"/>
-        <w:jc w:val="both"/>
-        <w:rPr>
-          <w:lang w:val="fr-CA" w:bidi="fa-IR"/>
-        </w:rPr>
-      </w:pPr>
-      <w:r>
-        <w:rPr>
-          <w:lang w:val="fr-CA" w:bidi="fa-IR"/>
-        </w:rPr>
-        <w:t>3.1.1.1. Le système doit permettre à l’utilisateur de créer un compte client</w:t>
+          <w:lang w:val="fr-CA" w:bidi="fa-IR"/>
+        </w:rPr>
+        <w:t>portables disponibles</w:t>
       </w:r>
       <w:r>
         <w:rPr>
@@ -2272,38 +2594,50 @@
         </w:rPr>
         <w:t>]</w:t>
       </w:r>
-    </w:p>
-    <w:p>
-      <w:pPr>
-        <w:ind w:left="1416"/>
-        <w:jc w:val="both"/>
-        <w:rPr>
-          <w:lang w:val="fr-CA" w:bidi="fa-IR"/>
-        </w:rPr>
-      </w:pPr>
-      <w:r>
-        <w:rPr>
-          <w:lang w:val="fr-CA" w:bidi="fa-IR"/>
-        </w:rPr>
-        <w:t xml:space="preserve">3.1.1.2. </w:t>
-      </w:r>
-      <w:r>
-        <w:rPr>
-          <w:lang w:val="fr-CA" w:bidi="fa-IR"/>
-        </w:rPr>
-        <w:t xml:space="preserve">Le système doit permettre à l’utilisateur de créer un compte </w:t>
-      </w:r>
-      <w:r>
-        <w:rPr>
-          <w:lang w:val="fr-CA" w:bidi="fa-IR"/>
-        </w:rPr>
-        <w:t>à l’aide d’une adresse courriel unique</w:t>
-      </w:r>
-      <w:r>
-        <w:rPr>
-          <w:lang w:val="fr-CA" w:bidi="fa-IR"/>
-        </w:rPr>
-        <w:t xml:space="preserve">. </w:t>
+      <w:r>
+        <w:rPr>
+          <w:lang w:val="fr-CA" w:bidi="fa-IR"/>
+        </w:rPr>
+        <w:t xml:space="preserve"> </w:t>
+      </w:r>
+    </w:p>
+    <w:p>
+      <w:pPr>
+        <w:ind w:left="1416" w:firstLine="2"/>
+        <w:jc w:val="both"/>
+        <w:rPr>
+          <w:lang w:val="fr-CA" w:bidi="fa-IR"/>
+        </w:rPr>
+      </w:pPr>
+      <w:r>
+        <w:rPr>
+          <w:lang w:val="fr-CA" w:bidi="fa-IR"/>
+        </w:rPr>
+        <w:t>3.1.2.2.</w:t>
+      </w:r>
+      <w:r>
+        <w:rPr>
+          <w:lang w:val="fr-CA" w:bidi="fa-IR"/>
+        </w:rPr>
+        <w:t xml:space="preserve"> </w:t>
+      </w:r>
+      <w:r>
+        <w:rPr>
+          <w:lang w:val="fr-CA" w:bidi="fa-IR"/>
+        </w:rPr>
+        <w:t xml:space="preserve">Le système doit permettre à l’utilisateur de consulter la </w:t>
+      </w:r>
+      <w:r>
+        <w:rPr>
+          <w:lang w:val="fr-CA" w:bidi="fa-IR"/>
+        </w:rPr>
+        <w:t xml:space="preserve">fiche détaillée </w:t>
+      </w:r>
+      <w:r>
+        <w:rPr>
+          <w:lang w:val="fr-CA" w:bidi="fa-IR"/>
+        </w:rPr>
+        <w:t xml:space="preserve">d’un ordinateur portable. </w:t>
       </w:r>
       <w:r>
         <w:rPr>
@@ -2332,29 +2666,77 @@
     </w:p>
     <w:p>
       <w:pPr>
-        <w:ind w:left="1416"/>
-        <w:jc w:val="both"/>
-        <w:rPr>
-          <w:lang w:val="fr-CA" w:bidi="fa-IR"/>
-        </w:rPr>
-      </w:pPr>
-      <w:r>
-        <w:rPr>
-          <w:lang w:val="fr-CA" w:bidi="fa-IR"/>
-        </w:rPr>
-        <w:t xml:space="preserve">3.1.1.3. </w:t>
-      </w:r>
-      <w:r>
-        <w:rPr>
-          <w:lang w:val="fr-CA" w:bidi="fa-IR"/>
-        </w:rPr>
-        <w:t>Le système doit permettre à l’utilisateur de créer un compte avec un mot de passe sécurisé</w:t>
-      </w:r>
-      <w:r>
-        <w:rPr>
-          <w:lang w:val="fr-CA" w:bidi="fa-IR"/>
-        </w:rPr>
-        <w:t xml:space="preserve">. </w:t>
+        <w:ind w:left="1416" w:firstLine="2"/>
+        <w:jc w:val="both"/>
+        <w:rPr>
+          <w:lang w:val="fr-CA" w:bidi="fa-IR"/>
+        </w:rPr>
+      </w:pPr>
+      <w:r>
+        <w:rPr>
+          <w:lang w:val="fr-CA" w:bidi="fa-IR"/>
+        </w:rPr>
+        <w:t>3.1.</w:t>
+      </w:r>
+      <w:r>
+        <w:rPr>
+          <w:lang w:val="fr-CA" w:bidi="fa-IR"/>
+        </w:rPr>
+        <w:t>2.3.</w:t>
+      </w:r>
+      <w:r>
+        <w:rPr>
+          <w:lang w:val="fr-CA" w:bidi="fa-IR"/>
+        </w:rPr>
+        <w:t xml:space="preserve"> Le système doit permettre à l’utilisateur de</w:t>
+      </w:r>
+      <w:r>
+        <w:rPr>
+          <w:lang w:val="fr-CA" w:bidi="fa-IR"/>
+        </w:rPr>
+        <w:t xml:space="preserve"> </w:t>
+      </w:r>
+      <w:r>
+        <w:rPr>
+          <w:lang w:val="fr-CA" w:bidi="fa-IR"/>
+        </w:rPr>
+        <w:t xml:space="preserve">filtrer les produits selon </w:t>
+      </w:r>
+      <w:r>
+        <w:rPr>
+          <w:lang w:val="fr-CA" w:bidi="fa-IR"/>
+        </w:rPr>
+        <w:t>différents critères (</w:t>
+      </w:r>
+      <w:r>
+        <w:rPr>
+          <w:lang w:val="fr-CA" w:bidi="fa-IR"/>
+        </w:rPr>
+        <w:t xml:space="preserve">prix, marque, </w:t>
+      </w:r>
+      <w:r>
+        <w:rPr>
+          <w:lang w:val="fr-CA" w:bidi="fa-IR"/>
+        </w:rPr>
+        <w:t>spécifications</w:t>
+      </w:r>
+      <w:r>
+        <w:rPr>
+          <w:lang w:val="fr-CA" w:bidi="fa-IR"/>
+        </w:rPr>
+        <w:t>)</w:t>
+      </w:r>
+      <w:r>
+        <w:rPr>
+          <w:lang w:val="fr-CA" w:bidi="fa-IR"/>
+        </w:rPr>
+        <w:t>.</w:t>
+      </w:r>
+      <w:r>
+        <w:rPr>
+          <w:lang w:val="fr-CA" w:bidi="fa-IR"/>
+        </w:rPr>
+        <w:t xml:space="preserve"> </w:t>
       </w:r>
       <w:r>
         <w:rPr>
@@ -2366,6 +2748,161 @@
         <w:rPr>
           <w:lang w:val="fr-CA" w:bidi="fa-IR"/>
         </w:rPr>
+        <w:t>Souhaitable</w:t>
+      </w:r>
+      <w:r>
+        <w:rPr>
+          <w:lang w:val="fr-CA" w:bidi="fa-IR"/>
+        </w:rPr>
+        <w:t>]</w:t>
+      </w:r>
+      <w:r>
+        <w:rPr>
+          <w:lang w:val="fr-CA" w:bidi="fa-IR"/>
+        </w:rPr>
+        <w:t xml:space="preserve"> </w:t>
+      </w:r>
+    </w:p>
+    <w:p>
+      <w:pPr>
+        <w:ind w:left="1416" w:firstLine="2"/>
+        <w:jc w:val="both"/>
+        <w:rPr>
+          <w:lang w:val="fr-CA" w:bidi="fa-IR"/>
+        </w:rPr>
+      </w:pPr>
+      <w:r>
+        <w:rPr>
+          <w:lang w:val="fr-CA" w:bidi="fa-IR"/>
+        </w:rPr>
+        <w:t>3.1.2.4.</w:t>
+      </w:r>
+      <w:r>
+        <w:rPr>
+          <w:lang w:val="fr-CA" w:bidi="fa-IR"/>
+        </w:rPr>
+        <w:t xml:space="preserve"> </w:t>
+      </w:r>
+      <w:r>
+        <w:rPr>
+          <w:lang w:val="fr-CA" w:bidi="fa-IR"/>
+        </w:rPr>
+        <w:t>Le système doit permettre à l’utilisateur de</w:t>
+      </w:r>
+      <w:r>
+        <w:rPr>
+          <w:lang w:val="fr-CA" w:bidi="fa-IR"/>
+        </w:rPr>
+        <w:t xml:space="preserve"> rechercher un produit par mot-clé</w:t>
+      </w:r>
+      <w:r>
+        <w:rPr>
+          <w:lang w:val="fr-CA" w:bidi="fa-IR"/>
+        </w:rPr>
+        <w:t>.</w:t>
+      </w:r>
+      <w:r>
+        <w:rPr>
+          <w:lang w:val="fr-CA" w:bidi="fa-IR"/>
+        </w:rPr>
+        <w:t xml:space="preserve"> </w:t>
+      </w:r>
+      <w:r>
+        <w:rPr>
+          <w:lang w:val="fr-CA" w:bidi="fa-IR"/>
+        </w:rPr>
+        <w:t>[</w:t>
+      </w:r>
+      <w:r>
+        <w:rPr>
+          <w:lang w:val="fr-CA" w:bidi="fa-IR"/>
+        </w:rPr>
+        <w:t>Souhaitable</w:t>
+      </w:r>
+      <w:r>
+        <w:rPr>
+          <w:lang w:val="fr-CA" w:bidi="fa-IR"/>
+        </w:rPr>
+        <w:t>]</w:t>
+      </w:r>
+    </w:p>
+    <w:p>
+      <w:pPr>
+        <w:jc w:val="both"/>
+        <w:rPr>
+          <w:lang w:val="fr-CA" w:bidi="fa-IR"/>
+        </w:rPr>
+      </w:pPr>
+      <w:r>
+        <w:rPr>
+          <w:lang w:val="fr-CA" w:bidi="fa-IR"/>
+        </w:rPr>
+        <w:tab/>
+      </w:r>
+    </w:p>
+    <w:p>
+      <w:pPr>
+        <w:ind w:firstLine="708"/>
+        <w:jc w:val="both"/>
+        <w:rPr>
+          <w:lang w:val="fr-CA" w:bidi="fa-IR"/>
+        </w:rPr>
+      </w:pPr>
+      <w:r>
+        <w:rPr>
+          <w:lang w:val="fr-CA" w:bidi="fa-IR"/>
+        </w:rPr>
+        <w:t>3.1.3. Panier d’achat</w:t>
+      </w:r>
+    </w:p>
+    <w:p>
+      <w:pPr>
+        <w:ind w:left="1416" w:firstLine="2"/>
+        <w:jc w:val="both"/>
+        <w:rPr>
+          <w:lang w:val="fr-CA" w:bidi="fa-IR"/>
+        </w:rPr>
+      </w:pPr>
+      <w:r>
+        <w:rPr>
+          <w:lang w:val="fr-CA" w:bidi="fa-IR"/>
+        </w:rPr>
+        <w:t>3.1.3.1. Le système doit permettre à l’utilisateur d</w:t>
+      </w:r>
+      <w:r>
+        <w:rPr>
+          <w:lang w:val="fr-CA" w:bidi="fa-IR"/>
+        </w:rPr>
+        <w:t>’ajouter un ordinateur portable</w:t>
+      </w:r>
+      <w:r>
+        <w:rPr>
+          <w:lang w:val="fr-CA" w:bidi="fa-IR"/>
+        </w:rPr>
+        <w:t xml:space="preserve"> </w:t>
+      </w:r>
+      <w:r>
+        <w:rPr>
+          <w:lang w:val="fr-CA" w:bidi="fa-IR"/>
+        </w:rPr>
+        <w:t>à son panier d’achat.</w:t>
+      </w:r>
+      <w:r>
+        <w:rPr>
+          <w:lang w:val="fr-CA" w:bidi="fa-IR"/>
+        </w:rPr>
+        <w:t xml:space="preserve"> </w:t>
+      </w:r>
+      <w:r>
+        <w:rPr>
+          <w:lang w:val="fr-CA" w:bidi="fa-IR"/>
+        </w:rPr>
+        <w:t>[</w:t>
+      </w:r>
+      <w:r>
+        <w:rPr>
+          <w:lang w:val="fr-CA" w:bidi="fa-IR"/>
+        </w:rPr>
         <w:t>Essentielle</w:t>
       </w:r>
       <w:r>
@@ -2374,39 +2911,39 @@
         </w:rPr>
         <w:t>]</w:t>
       </w:r>
-    </w:p>
-    <w:p>
-      <w:pPr>
-        <w:ind w:left="1416"/>
-        <w:jc w:val="both"/>
-        <w:rPr>
-          <w:lang w:val="fr-CA" w:bidi="fa-IR"/>
-        </w:rPr>
-      </w:pPr>
-      <w:r>
-        <w:rPr>
-          <w:lang w:val="fr-CA" w:bidi="fa-IR"/>
-        </w:rPr>
-        <w:t xml:space="preserve">3.1.1.4. Le système doit permettre à l’utilisateur de se connecter à son </w:t>
-      </w:r>
-      <w:r>
-        <w:rPr>
-          <w:lang w:val="fr-CA" w:bidi="fa-IR"/>
-        </w:rPr>
-        <w:t xml:space="preserve">compte à l’aide de son courriel </w:t>
-      </w:r>
-      <w:r>
-        <w:rPr>
-          <w:lang w:val="fr-CA" w:bidi="fa-IR"/>
-        </w:rPr>
-        <w:t>et de son mot de passe.</w:t>
-      </w:r>
       <w:r>
         <w:rPr>
           <w:lang w:val="fr-CA" w:bidi="fa-IR"/>
         </w:rPr>
         <w:t xml:space="preserve"> </w:t>
       </w:r>
+    </w:p>
+    <w:p>
+      <w:pPr>
+        <w:ind w:left="1416" w:firstLine="2"/>
+        <w:jc w:val="both"/>
+        <w:rPr>
+          <w:lang w:val="fr-CA" w:bidi="fa-IR"/>
+        </w:rPr>
+      </w:pPr>
+      <w:r>
+        <w:rPr>
+          <w:lang w:val="fr-CA" w:bidi="fa-IR"/>
+        </w:rPr>
+        <w:t xml:space="preserve">3.1.3.2. Le système doit permettre à l’utilisateur de modifier </w:t>
+      </w:r>
+      <w:r>
+        <w:rPr>
+          <w:lang w:val="fr-CA" w:bidi="fa-IR"/>
+        </w:rPr>
+        <w:t>la quantité d’un produit dans le panier.</w:t>
+      </w:r>
+      <w:r>
+        <w:rPr>
+          <w:lang w:val="fr-CA" w:bidi="fa-IR"/>
+        </w:rPr>
+        <w:t xml:space="preserve"> </w:t>
+      </w:r>
       <w:r>
         <w:rPr>
           <w:lang w:val="fr-CA" w:bidi="fa-IR"/>
@@ -2425,26 +2962,38 @@
         </w:rPr>
         <w:t>]</w:t>
       </w:r>
-    </w:p>
-    <w:p>
-      <w:pPr>
-        <w:ind w:left="1416"/>
-        <w:jc w:val="both"/>
-        <w:rPr>
-          <w:lang w:val="fr-CA" w:bidi="fa-IR"/>
-        </w:rPr>
-      </w:pPr>
-      <w:r>
-        <w:rPr>
-          <w:lang w:val="fr-CA" w:bidi="fa-IR"/>
-        </w:rPr>
-        <w:t xml:space="preserve">3.1.1.5. Le système doit permettre à l’utilisateur de se </w:t>
-      </w:r>
-      <w:r>
-        <w:rPr>
-          <w:lang w:val="fr-CA" w:bidi="fa-IR"/>
-        </w:rPr>
-        <w:t xml:space="preserve">déconnecter de son compte. </w:t>
+      <w:r>
+        <w:rPr>
+          <w:lang w:val="fr-CA" w:bidi="fa-IR"/>
+        </w:rPr>
+        <w:t xml:space="preserve"> </w:t>
+      </w:r>
+    </w:p>
+    <w:p>
+      <w:pPr>
+        <w:ind w:left="1416" w:firstLine="2"/>
+        <w:jc w:val="both"/>
+        <w:rPr>
+          <w:lang w:val="fr-CA" w:bidi="fa-IR"/>
+        </w:rPr>
+      </w:pPr>
+      <w:r>
+        <w:rPr>
+          <w:lang w:val="fr-CA" w:bidi="fa-IR"/>
+        </w:rPr>
+        <w:t>3.1.3.3. Le système doit permettre à l’utilisateur de retirer un produit du panier</w:t>
+      </w:r>
+      <w:r>
+        <w:rPr>
+          <w:lang w:val="fr-CA" w:bidi="fa-IR"/>
+        </w:rPr>
+        <w:t>.</w:t>
+      </w:r>
+      <w:r>
+        <w:rPr>
+          <w:lang w:val="fr-CA" w:bidi="fa-IR"/>
+        </w:rPr>
+        <w:t xml:space="preserve"> </w:t>
       </w:r>
       <w:r>
         <w:rPr>
@@ -2473,41 +3022,6 @@
     </w:p>
     <w:p>
       <w:pPr>
-        <w:jc w:val="both"/>
-        <w:rPr>
-          <w:lang w:val="fr-CA" w:bidi="fa-IR"/>
-        </w:rPr>
-      </w:pPr>
-      <w:r>
-        <w:rPr>
-          <w:lang w:val="fr-CA" w:bidi="fa-IR"/>
-        </w:rPr>
-        <w:tab/>
-      </w:r>
-    </w:p>
-    <w:p>
-      <w:pPr>
-        <w:ind w:firstLine="708"/>
-        <w:jc w:val="both"/>
-        <w:rPr>
-          <w:lang w:val="fr-CA" w:bidi="fa-IR"/>
-        </w:rPr>
-      </w:pPr>
-      <w:r>
-        <w:rPr>
-          <w:lang w:val="fr-CA" w:bidi="fa-IR"/>
-        </w:rPr>
-        <w:t xml:space="preserve">3.1.2. </w:t>
-      </w:r>
-      <w:r>
-        <w:rPr>
-          <w:lang w:val="fr-CA" w:bidi="fa-IR"/>
-        </w:rPr>
-        <w:t>Consultation et recherche de produit</w:t>
-      </w:r>
-    </w:p>
-    <w:p>
-      <w:pPr>
         <w:ind w:left="1416" w:firstLine="2"/>
         <w:jc w:val="both"/>
         <w:rPr>
@@ -2518,488 +3032,7 @@
         <w:rPr>
           <w:lang w:val="fr-CA" w:bidi="fa-IR"/>
         </w:rPr>
-        <w:t xml:space="preserve">3.1.2.1. Le système doit permettre à l’utilisateur de </w:t>
-      </w:r>
-      <w:r>
-        <w:rPr>
-          <w:lang w:val="fr-CA" w:bidi="fa-IR"/>
-        </w:rPr>
-        <w:t>consulter la liste des ordinateurs</w:t>
-      </w:r>
-      <w:r>
-        <w:rPr>
-          <w:lang w:val="fr-CA" w:bidi="fa-IR"/>
-        </w:rPr>
-        <w:t xml:space="preserve"> </w:t>
-      </w:r>
-      <w:r>
-        <w:rPr>
-          <w:lang w:val="fr-CA" w:bidi="fa-IR"/>
-        </w:rPr>
-        <w:t>portables disponibles</w:t>
-      </w:r>
-      <w:r>
-        <w:rPr>
-          <w:lang w:val="fr-CA" w:bidi="fa-IR"/>
-        </w:rPr>
-        <w:t xml:space="preserve">. </w:t>
-      </w:r>
-      <w:r>
-        <w:rPr>
-          <w:lang w:val="fr-CA" w:bidi="fa-IR"/>
-        </w:rPr>
-        <w:t>[</w:t>
-      </w:r>
-      <w:r>
-        <w:rPr>
-          <w:lang w:val="fr-CA" w:bidi="fa-IR"/>
-        </w:rPr>
-        <w:t>Essentielle</w:t>
-      </w:r>
-      <w:r>
-        <w:rPr>
-          <w:lang w:val="fr-CA" w:bidi="fa-IR"/>
-        </w:rPr>
-        <w:t>]</w:t>
-      </w:r>
-      <w:r>
-        <w:rPr>
-          <w:lang w:val="fr-CA" w:bidi="fa-IR"/>
-        </w:rPr>
-        <w:t xml:space="preserve"> </w:t>
-      </w:r>
-    </w:p>
-    <w:p>
-      <w:pPr>
-        <w:ind w:left="1416" w:firstLine="2"/>
-        <w:jc w:val="both"/>
-        <w:rPr>
-          <w:lang w:val="fr-CA" w:bidi="fa-IR"/>
-        </w:rPr>
-      </w:pPr>
-      <w:r>
-        <w:rPr>
-          <w:lang w:val="fr-CA" w:bidi="fa-IR"/>
-        </w:rPr>
-        <w:t>3.1.2.2.</w:t>
-      </w:r>
-      <w:r>
-        <w:rPr>
-          <w:lang w:val="fr-CA" w:bidi="fa-IR"/>
-        </w:rPr>
-        <w:t xml:space="preserve"> </w:t>
-      </w:r>
-      <w:r>
-        <w:rPr>
-          <w:lang w:val="fr-CA" w:bidi="fa-IR"/>
-        </w:rPr>
-        <w:t xml:space="preserve">Le système doit permettre à l’utilisateur de consulter la </w:t>
-      </w:r>
-      <w:r>
-        <w:rPr>
-          <w:lang w:val="fr-CA" w:bidi="fa-IR"/>
-        </w:rPr>
-        <w:t xml:space="preserve">fiche détaillée </w:t>
-      </w:r>
-      <w:r>
-        <w:rPr>
-          <w:lang w:val="fr-CA" w:bidi="fa-IR"/>
-        </w:rPr>
-        <w:t xml:space="preserve">d’un ordinateur portable. </w:t>
-      </w:r>
-      <w:r>
-        <w:rPr>
-          <w:lang w:val="fr-CA" w:bidi="fa-IR"/>
-        </w:rPr>
-        <w:t>[</w:t>
-      </w:r>
-      <w:r>
-        <w:rPr>
-          <w:lang w:val="fr-CA" w:bidi="fa-IR"/>
-        </w:rPr>
-        <w:t>Essentielle</w:t>
-      </w:r>
-      <w:r>
-        <w:rPr>
-          <w:lang w:val="fr-CA" w:bidi="fa-IR"/>
-        </w:rPr>
-        <w:t>]</w:t>
-      </w:r>
-      <w:r>
-        <w:rPr>
-          <w:lang w:val="fr-CA" w:bidi="fa-IR"/>
-        </w:rPr>
-        <w:t xml:space="preserve"> </w:t>
-      </w:r>
-    </w:p>
-    <w:p>
-      <w:pPr>
-        <w:ind w:left="1416" w:firstLine="2"/>
-        <w:jc w:val="both"/>
-        <w:rPr>
-          <w:lang w:val="fr-CA" w:bidi="fa-IR"/>
-        </w:rPr>
-      </w:pPr>
-      <w:r>
-        <w:rPr>
-          <w:lang w:val="fr-CA" w:bidi="fa-IR"/>
-        </w:rPr>
-        <w:t>3.1.</w:t>
-      </w:r>
-      <w:r>
-        <w:rPr>
-          <w:lang w:val="fr-CA" w:bidi="fa-IR"/>
-        </w:rPr>
-        <w:t>2.3.</w:t>
-      </w:r>
-      <w:r>
-        <w:rPr>
-          <w:lang w:val="fr-CA" w:bidi="fa-IR"/>
-        </w:rPr>
-        <w:t xml:space="preserve"> Le système doit permettre à l’utilisateur de</w:t>
-      </w:r>
-      <w:r>
-        <w:rPr>
-          <w:lang w:val="fr-CA" w:bidi="fa-IR"/>
-        </w:rPr>
-        <w:t xml:space="preserve"> </w:t>
-      </w:r>
-      <w:r>
-        <w:rPr>
-          <w:lang w:val="fr-CA" w:bidi="fa-IR"/>
-        </w:rPr>
-        <w:t xml:space="preserve">filtrer les produits selon </w:t>
-      </w:r>
-      <w:r>
-        <w:rPr>
-          <w:lang w:val="fr-CA" w:bidi="fa-IR"/>
-        </w:rPr>
-        <w:t>différents critères (</w:t>
-      </w:r>
-      <w:r>
-        <w:rPr>
-          <w:lang w:val="fr-CA" w:bidi="fa-IR"/>
-        </w:rPr>
-        <w:t xml:space="preserve">prix, marque, </w:t>
-      </w:r>
-      <w:r>
-        <w:rPr>
-          <w:lang w:val="fr-CA" w:bidi="fa-IR"/>
-        </w:rPr>
-        <w:t>spécifications</w:t>
-      </w:r>
-      <w:r>
-        <w:rPr>
-          <w:lang w:val="fr-CA" w:bidi="fa-IR"/>
-        </w:rPr>
-        <w:t>)</w:t>
-      </w:r>
-      <w:r>
-        <w:rPr>
-          <w:lang w:val="fr-CA" w:bidi="fa-IR"/>
-        </w:rPr>
-        <w:t>.</w:t>
-      </w:r>
-      <w:r>
-        <w:rPr>
-          <w:lang w:val="fr-CA" w:bidi="fa-IR"/>
-        </w:rPr>
-        <w:t xml:space="preserve"> </w:t>
-      </w:r>
-      <w:r>
-        <w:rPr>
-          <w:lang w:val="fr-CA" w:bidi="fa-IR"/>
-        </w:rPr>
-        <w:t>[</w:t>
-      </w:r>
-      <w:r>
-        <w:rPr>
-          <w:lang w:val="fr-CA" w:bidi="fa-IR"/>
-        </w:rPr>
-        <w:t>Souhaitable</w:t>
-      </w:r>
-      <w:r>
-        <w:rPr>
-          <w:lang w:val="fr-CA" w:bidi="fa-IR"/>
-        </w:rPr>
-        <w:t>]</w:t>
-      </w:r>
-      <w:r>
-        <w:rPr>
-          <w:lang w:val="fr-CA" w:bidi="fa-IR"/>
-        </w:rPr>
-        <w:t xml:space="preserve"> </w:t>
-      </w:r>
-    </w:p>
-    <w:p>
-      <w:pPr>
-        <w:ind w:left="1416" w:firstLine="2"/>
-        <w:jc w:val="both"/>
-        <w:rPr>
-          <w:lang w:val="fr-CA" w:bidi="fa-IR"/>
-        </w:rPr>
-      </w:pPr>
-      <w:r>
-        <w:rPr>
-          <w:lang w:val="fr-CA" w:bidi="fa-IR"/>
-        </w:rPr>
-        <w:t>3.1.2.4.</w:t>
-      </w:r>
-      <w:r>
-        <w:rPr>
-          <w:lang w:val="fr-CA" w:bidi="fa-IR"/>
-        </w:rPr>
-        <w:t xml:space="preserve"> </w:t>
-      </w:r>
-      <w:r>
-        <w:rPr>
-          <w:lang w:val="fr-CA" w:bidi="fa-IR"/>
-        </w:rPr>
-        <w:t>Le système doit permettre à l’utilisateur de</w:t>
-      </w:r>
-      <w:r>
-        <w:rPr>
-          <w:lang w:val="fr-CA" w:bidi="fa-IR"/>
-        </w:rPr>
-        <w:t xml:space="preserve"> rechercher un produit par mot-clé</w:t>
-      </w:r>
-      <w:r>
-        <w:rPr>
-          <w:lang w:val="fr-CA" w:bidi="fa-IR"/>
-        </w:rPr>
-        <w:t>.</w:t>
-      </w:r>
-      <w:r>
-        <w:rPr>
-          <w:lang w:val="fr-CA" w:bidi="fa-IR"/>
-        </w:rPr>
-        <w:t xml:space="preserve"> </w:t>
-      </w:r>
-      <w:r>
-        <w:rPr>
-          <w:lang w:val="fr-CA" w:bidi="fa-IR"/>
-        </w:rPr>
-        <w:t>[</w:t>
-      </w:r>
-      <w:r>
-        <w:rPr>
-          <w:lang w:val="fr-CA" w:bidi="fa-IR"/>
-        </w:rPr>
-        <w:t>Souhaitable</w:t>
-      </w:r>
-      <w:r>
-        <w:rPr>
-          <w:lang w:val="fr-CA" w:bidi="fa-IR"/>
-        </w:rPr>
-        <w:t>]</w:t>
-      </w:r>
-    </w:p>
-    <w:p>
-      <w:pPr>
-        <w:jc w:val="both"/>
-        <w:rPr>
-          <w:lang w:val="fr-CA" w:bidi="fa-IR"/>
-        </w:rPr>
-      </w:pPr>
-      <w:r>
-        <w:rPr>
-          <w:lang w:val="fr-CA" w:bidi="fa-IR"/>
-        </w:rPr>
-        <w:tab/>
-      </w:r>
-    </w:p>
-    <w:p>
-      <w:pPr>
-        <w:ind w:firstLine="708"/>
-        <w:jc w:val="both"/>
-        <w:rPr>
-          <w:lang w:val="fr-CA" w:bidi="fa-IR"/>
-        </w:rPr>
-      </w:pPr>
-      <w:r>
-        <w:rPr>
-          <w:lang w:val="fr-CA" w:bidi="fa-IR"/>
-        </w:rPr>
-        <w:t>3.1.3. Panier d’achat</w:t>
-      </w:r>
-    </w:p>
-    <w:p>
-      <w:pPr>
-        <w:ind w:left="1416" w:firstLine="2"/>
-        <w:jc w:val="both"/>
-        <w:rPr>
-          <w:lang w:val="fr-CA" w:bidi="fa-IR"/>
-        </w:rPr>
-      </w:pPr>
-      <w:r>
-        <w:rPr>
-          <w:lang w:val="fr-CA" w:bidi="fa-IR"/>
-        </w:rPr>
-        <w:t>3.1.3.1. Le système doit permettre à l’utilisateur d</w:t>
-      </w:r>
-      <w:r>
-        <w:rPr>
-          <w:lang w:val="fr-CA" w:bidi="fa-IR"/>
-        </w:rPr>
-        <w:t>’ajouter un ordinateur portable</w:t>
-      </w:r>
-      <w:r>
-        <w:rPr>
-          <w:lang w:val="fr-CA" w:bidi="fa-IR"/>
-        </w:rPr>
-        <w:t xml:space="preserve"> </w:t>
-      </w:r>
-      <w:r>
-        <w:rPr>
-          <w:lang w:val="fr-CA" w:bidi="fa-IR"/>
-        </w:rPr>
-        <w:t>à son panier d’achat.</w:t>
-      </w:r>
-      <w:r>
-        <w:rPr>
-          <w:lang w:val="fr-CA" w:bidi="fa-IR"/>
-        </w:rPr>
-        <w:t xml:space="preserve"> </w:t>
-      </w:r>
-      <w:r>
-        <w:rPr>
-          <w:lang w:val="fr-CA" w:bidi="fa-IR"/>
-        </w:rPr>
-        <w:t>[</w:t>
-      </w:r>
-      <w:r>
-        <w:rPr>
-          <w:lang w:val="fr-CA" w:bidi="fa-IR"/>
-        </w:rPr>
-        <w:t>Essentielle</w:t>
-      </w:r>
-      <w:r>
-        <w:rPr>
-          <w:lang w:val="fr-CA" w:bidi="fa-IR"/>
-        </w:rPr>
-        <w:t>]</w:t>
-      </w:r>
-      <w:r>
-        <w:rPr>
-          <w:lang w:val="fr-CA" w:bidi="fa-IR"/>
-        </w:rPr>
-        <w:t xml:space="preserve"> </w:t>
-      </w:r>
-    </w:p>
-    <w:p>
-      <w:pPr>
-        <w:ind w:left="1416" w:firstLine="2"/>
-        <w:jc w:val="both"/>
-        <w:rPr>
-          <w:lang w:val="fr-CA" w:bidi="fa-IR"/>
-        </w:rPr>
-      </w:pPr>
-      <w:r>
-        <w:rPr>
-          <w:lang w:val="fr-CA" w:bidi="fa-IR"/>
-        </w:rPr>
-        <w:t xml:space="preserve">3.1.3.2. Le système doit permettre à l’utilisateur de modifier </w:t>
-      </w:r>
-      <w:r>
-        <w:rPr>
-          <w:lang w:val="fr-CA" w:bidi="fa-IR"/>
-        </w:rPr>
-        <w:t>la quantité d’un produit dans le panier.</w:t>
-      </w:r>
-      <w:r>
-        <w:rPr>
-          <w:lang w:val="fr-CA" w:bidi="fa-IR"/>
-        </w:rPr>
-        <w:t xml:space="preserve"> </w:t>
-      </w:r>
-      <w:r>
-        <w:rPr>
-          <w:lang w:val="fr-CA" w:bidi="fa-IR"/>
-        </w:rPr>
-        <w:t>[</w:t>
-      </w:r>
-      <w:r>
-        <w:rPr>
-          <w:lang w:val="fr-CA" w:bidi="fa-IR"/>
-        </w:rPr>
-        <w:t>Essentielle</w:t>
-      </w:r>
-      <w:r>
-        <w:rPr>
-          <w:lang w:val="fr-CA" w:bidi="fa-IR"/>
-        </w:rPr>
-        <w:t>]</w:t>
-      </w:r>
-      <w:r>
-        <w:rPr>
-          <w:lang w:val="fr-CA" w:bidi="fa-IR"/>
-        </w:rPr>
-        <w:t xml:space="preserve"> </w:t>
-      </w:r>
-    </w:p>
-    <w:p>
-      <w:pPr>
-        <w:ind w:left="1416" w:firstLine="2"/>
-        <w:jc w:val="both"/>
-        <w:rPr>
-          <w:lang w:val="fr-CA" w:bidi="fa-IR"/>
-        </w:rPr>
-      </w:pPr>
-      <w:r>
-        <w:rPr>
-          <w:lang w:val="fr-CA" w:bidi="fa-IR"/>
-        </w:rPr>
-        <w:t>3.1.3.3. Le système doit permettre à l’utilisateur de retirer un produit du panier</w:t>
-      </w:r>
-      <w:r>
-        <w:rPr>
-          <w:lang w:val="fr-CA" w:bidi="fa-IR"/>
-        </w:rPr>
-        <w:t>.</w:t>
-      </w:r>
-      <w:r>
-        <w:rPr>
-          <w:lang w:val="fr-CA" w:bidi="fa-IR"/>
-        </w:rPr>
-        <w:t xml:space="preserve"> </w:t>
-      </w:r>
-      <w:r>
-        <w:rPr>
-          <w:lang w:val="fr-CA" w:bidi="fa-IR"/>
-        </w:rPr>
-        <w:t>[</w:t>
-      </w:r>
-      <w:r>
-        <w:rPr>
-          <w:lang w:val="fr-CA" w:bidi="fa-IR"/>
-        </w:rPr>
-        <w:t>Essentielle</w:t>
-      </w:r>
-      <w:r>
-        <w:rPr>
-          <w:lang w:val="fr-CA" w:bidi="fa-IR"/>
-        </w:rPr>
-        <w:t>]</w:t>
-      </w:r>
-      <w:r>
-        <w:rPr>
-          <w:lang w:val="fr-CA" w:bidi="fa-IR"/>
-        </w:rPr>
-        <w:t xml:space="preserve"> </w:t>
-      </w:r>
-    </w:p>
-    <w:p>
-      <w:pPr>
-        <w:ind w:left="1416" w:firstLine="2"/>
-        <w:jc w:val="both"/>
-        <w:rPr>
-          <w:lang w:val="fr-CA" w:bidi="fa-IR"/>
-        </w:rPr>
-      </w:pPr>
-      <w:r>
-        <w:rPr>
-          <w:lang w:val="fr-CA" w:bidi="fa-IR"/>
-        </w:rPr>
+        <w:lastRenderedPageBreak/>
         <w:t>3.1.3.4. Le système doit permettre à l’utilisateur de consulter le contenu de son panier</w:t>
       </w:r>
       <w:r>
@@ -3792,6 +3825,7 @@
         <w:rPr>
           <w:lang w:val="fr-CA"/>
         </w:rPr>
+        <w:lastRenderedPageBreak/>
         <w:t>3.2.</w:t>
       </w:r>
       <w:r>
@@ -4346,6 +4380,7 @@
         <w:rPr>
           <w:lang w:val="fr-CA"/>
         </w:rPr>
+        <w:lastRenderedPageBreak/>
         <w:t xml:space="preserve">3.4.1.3. </w:t>
       </w:r>
       <w:r>
@@ -4985,6 +5020,7 @@
         <w:rPr>
           <w:lang w:val="fr-CA" w:bidi="fa-IR"/>
         </w:rPr>
+        <w:lastRenderedPageBreak/>
         <w:t xml:space="preserve">3.5.2.2. </w:t>
       </w:r>
       <w:r>
@@ -5213,14 +5249,819 @@
     </w:p>
     <w:p>
       <w:pPr>
-        <w:pStyle w:val="Heading1"/>
+        <w:pStyle w:val="Titre1"/>
         <w:numPr>
           <w:ilvl w:val="0"/>
           <w:numId w:val="1"/>
         </w:numPr>
+        <w:rPr>
+          <w:lang w:val="fr-CA" w:bidi="fa-IR"/>
+        </w:rPr>
+      </w:pPr>
+      <w:r>
+        <w:rPr>
+          <w:lang w:val="fr-CA" w:bidi="fa-IR"/>
+        </w:rPr>
+        <w:lastRenderedPageBreak/>
+        <w:t>Exigences non</w:t>
+      </w:r>
+      <w:r>
+        <w:rPr>
+          <w:lang w:val="fr-CA" w:bidi="fa-IR"/>
+        </w:rPr>
+        <w:t xml:space="preserve"> </w:t>
+      </w:r>
+      <w:r>
+        <w:rPr>
+          <w:lang w:val="fr-CA" w:bidi="fa-IR"/>
+        </w:rPr>
+        <w:t>fonction</w:t>
+      </w:r>
+      <w:r>
+        <w:rPr>
+          <w:lang w:val="fr-CA" w:bidi="fa-IR"/>
+        </w:rPr>
+        <w:t>n</w:t>
+      </w:r>
+      <w:r>
+        <w:rPr>
+          <w:lang w:val="fr-CA" w:bidi="fa-IR"/>
+        </w:rPr>
+        <w:t>elles</w:t>
+      </w:r>
+    </w:p>
+    <w:p>
+      <w:pPr>
+        <w:rPr>
+          <w:lang w:val="fr-CA" w:bidi="fa-IR"/>
+        </w:rPr>
+      </w:pPr>
+    </w:p>
+    <w:p>
+      <w:pPr>
+        <w:jc w:val="both"/>
+        <w:rPr>
+          <w:lang w:val="fr-CA" w:bidi="fa-IR"/>
+        </w:rPr>
+      </w:pPr>
+      <w:r>
+        <w:rPr>
+          <w:lang w:val="fr-CA" w:bidi="fa-IR"/>
+        </w:rPr>
+        <w:t>Les exigences non fonctionnelles désignent les attributs de qualité d'un système qui définissent ses performances plutôt que ses fonctions. Contrairement aux exigences fonctionnelles, qui spécifient les actions et les tâches qu'un système doit accomplir, les exigences non fonctionnelles se concentrent sur les caractéristiques globales et le comportement du système dans diverses conditions. Elles abordent des aspects tels que la performance, la convivialité, la fiabilité et l'évolutivité, garantissant ainsi que le système répond aux normes de qualité et offre une expérience utilisateur satisfaisante.</w:t>
+      </w:r>
+      <w:r>
+        <w:rPr>
+          <w:rStyle w:val="Appelnotedebasdep"/>
+          <w:lang w:val="fr-CA" w:bidi="fa-IR"/>
+        </w:rPr>
+        <w:footnoteReference w:id="3"/>
+      </w:r>
+    </w:p>
+    <w:p>
+      <w:pPr>
+        <w:jc w:val="both"/>
+        <w:rPr>
+          <w:lang w:val="fr-CA" w:bidi="fa-IR"/>
+        </w:rPr>
+      </w:pPr>
+    </w:p>
+    <w:p>
+      <w:pPr>
+        <w:jc w:val="both"/>
+        <w:rPr>
+          <w:b/>
+          <w:bCs/>
+          <w:lang w:val="fr-CA" w:bidi="fa-IR"/>
+        </w:rPr>
+      </w:pPr>
+      <w:r>
+        <w:rPr>
+          <w:b/>
+          <w:bCs/>
+          <w:lang w:val="fr-CA" w:bidi="fa-IR"/>
+        </w:rPr>
+        <w:t>4.1. Performance</w:t>
+      </w:r>
+      <w:r>
+        <w:rPr>
+          <w:b/>
+          <w:bCs/>
+          <w:lang w:val="fr-CA" w:bidi="fa-IR"/>
+        </w:rPr>
+        <w:t>s</w:t>
+      </w:r>
+    </w:p>
+    <w:p>
+      <w:pPr>
+        <w:jc w:val="both"/>
+        <w:rPr>
+          <w:b/>
+          <w:bCs/>
+          <w:lang w:val="fr-CA" w:bidi="fa-IR"/>
+        </w:rPr>
+      </w:pPr>
+    </w:p>
+    <w:p>
+      <w:pPr>
+        <w:ind w:left="705"/>
+        <w:jc w:val="both"/>
+        <w:rPr>
+          <w:lang w:val="fr-CA" w:bidi="fa-IR"/>
+        </w:rPr>
+      </w:pPr>
+      <w:r>
+        <w:rPr>
+          <w:lang w:val="fr-CA" w:bidi="fa-IR"/>
+        </w:rPr>
+        <w:t>4.1.1. Le système doit afficher les pages principales (Accueil, Produits, Panier) en moins de 2 secondes dans des conditions normales d’utilisation. [Essentielle]</w:t>
+      </w:r>
+    </w:p>
+    <w:p>
+      <w:pPr>
+        <w:ind w:left="705"/>
+        <w:jc w:val="both"/>
+        <w:rPr>
+          <w:lang w:val="fr-CA" w:bidi="fa-IR"/>
+        </w:rPr>
+      </w:pPr>
+    </w:p>
+    <w:p>
+      <w:pPr>
+        <w:ind w:left="705"/>
+        <w:jc w:val="both"/>
+        <w:rPr>
+          <w:lang w:val="fr-CA" w:bidi="fa-IR"/>
+        </w:rPr>
+      </w:pPr>
+      <w:r>
+        <w:rPr>
+          <w:lang w:val="fr-CA" w:bidi="fa-IR"/>
+        </w:rPr>
+        <w:t>4.1.2. Le système doit traiter les opérations principales (inscription, connexion, ajout au panier, commande) en moins de 2 secondes. [Essentielle]</w:t>
+      </w:r>
+    </w:p>
+    <w:p>
+      <w:pPr>
+        <w:ind w:left="705"/>
+        <w:jc w:val="both"/>
+        <w:rPr>
+          <w:lang w:val="fr-CA" w:bidi="fa-IR"/>
+        </w:rPr>
+      </w:pPr>
+    </w:p>
+    <w:p>
+      <w:pPr>
+        <w:ind w:left="705"/>
+        <w:jc w:val="both"/>
+        <w:rPr>
+          <w:lang w:val="fr-CA" w:bidi="fa-IR"/>
+        </w:rPr>
+      </w:pPr>
+      <w:r>
+        <w:rPr>
+          <w:lang w:val="fr-CA" w:bidi="fa-IR"/>
+        </w:rPr>
+        <w:t>4.1.3. Le système doit maintenir des performances acceptables lors des périodes de pointe, sans ralentissement majeur. [Souhaitable]</w:t>
+      </w:r>
+      <w:r>
+        <w:rPr>
+          <w:lang w:val="fr-CA" w:bidi="fa-IR"/>
+        </w:rPr>
+        <w:t xml:space="preserve"> </w:t>
+      </w:r>
+    </w:p>
+    <w:p>
+      <w:pPr>
+        <w:jc w:val="both"/>
+        <w:rPr>
+          <w:lang w:val="fr-CA" w:bidi="fa-IR"/>
+        </w:rPr>
+      </w:pPr>
+    </w:p>
+    <w:p>
+      <w:pPr>
+        <w:jc w:val="both"/>
+        <w:rPr>
+          <w:b/>
+          <w:bCs/>
+          <w:lang w:bidi="fa-IR"/>
+        </w:rPr>
+      </w:pPr>
+      <w:r>
+        <w:rPr>
+          <w:b/>
+          <w:bCs/>
+          <w:lang w:bidi="fa-IR"/>
+        </w:rPr>
+        <w:t>4.2. Évolutivité</w:t>
+      </w:r>
+      <w:r>
+        <w:rPr>
+          <w:b/>
+          <w:bCs/>
+          <w:lang w:bidi="fa-IR"/>
+        </w:rPr>
+        <w:t xml:space="preserve"> </w:t>
+      </w:r>
+    </w:p>
+    <w:p>
+      <w:pPr>
+        <w:jc w:val="both"/>
+        <w:rPr>
+          <w:b/>
+          <w:bCs/>
+          <w:lang w:bidi="fa-IR"/>
+        </w:rPr>
+      </w:pPr>
+      <w:r>
+        <w:rPr>
+          <w:b/>
+          <w:bCs/>
+          <w:lang w:bidi="fa-IR"/>
+        </w:rPr>
+        <w:tab/>
+      </w:r>
+    </w:p>
+    <w:p>
+      <w:pPr>
+        <w:ind w:left="708"/>
+        <w:jc w:val="both"/>
+        <w:rPr>
+          <w:lang w:bidi="fa-IR"/>
+        </w:rPr>
+      </w:pPr>
+      <w:r>
+        <w:rPr>
+          <w:lang w:bidi="fa-IR"/>
+        </w:rPr>
+        <w:t>4.2.1. Le système doit être capable de supporter une augmentation du nombre</w:t>
+      </w:r>
+      <w:r>
+        <w:rPr>
+          <w:lang w:bidi="fa-IR"/>
+        </w:rPr>
+        <w:t xml:space="preserve">     </w:t>
+      </w:r>
+      <w:r>
+        <w:rPr>
+          <w:lang w:bidi="fa-IR"/>
+        </w:rPr>
+        <w:t>d’utilisateurs sans modification majeure de l’architecture. [Souhaitable]</w:t>
+      </w:r>
+    </w:p>
+    <w:p>
+      <w:pPr>
+        <w:ind w:left="708"/>
+        <w:jc w:val="both"/>
+        <w:rPr>
+          <w:lang w:bidi="fa-IR"/>
+        </w:rPr>
+      </w:pPr>
+    </w:p>
+    <w:p>
+      <w:pPr>
+        <w:ind w:left="708"/>
+        <w:jc w:val="both"/>
+        <w:rPr>
+          <w:lang w:bidi="fa-IR"/>
+        </w:rPr>
+      </w:pPr>
+      <w:r>
+        <w:rPr>
+          <w:lang w:bidi="fa-IR"/>
+        </w:rPr>
+        <w:t>4.2.2. Le système doit pouvoir gérer une augmentation du nombre de produits dans la base de données sans dégradation significative des performances. [Souhaitable]</w:t>
+      </w:r>
+    </w:p>
+    <w:p>
+      <w:pPr>
+        <w:ind w:left="708"/>
+        <w:jc w:val="both"/>
+        <w:rPr>
+          <w:lang w:bidi="fa-IR"/>
+        </w:rPr>
+      </w:pPr>
+    </w:p>
+    <w:p>
+      <w:pPr>
+        <w:ind w:left="708"/>
+        <w:jc w:val="both"/>
+        <w:rPr>
+          <w:lang w:bidi="fa-IR"/>
+        </w:rPr>
+      </w:pPr>
+      <w:r>
+        <w:rPr>
+          <w:lang w:bidi="fa-IR"/>
+        </w:rPr>
+        <w:t>4.2.</w:t>
+      </w:r>
+      <w:r>
+        <w:rPr>
+          <w:lang w:bidi="fa-IR"/>
+        </w:rPr>
+        <w:t>3</w:t>
+      </w:r>
+      <w:r>
+        <w:rPr>
+          <w:lang w:bidi="fa-IR"/>
+        </w:rPr>
+        <w:t>. L’architecture API REST doit permettre l’ajout futur de nouvelles fonctionnalités sans refonte complète du système. [</w:t>
+      </w:r>
+      <w:r>
+        <w:rPr>
+          <w:lang w:bidi="fa-IR"/>
+        </w:rPr>
+        <w:t>Essentielle</w:t>
+      </w:r>
+      <w:r>
+        <w:rPr>
+          <w:lang w:bidi="fa-IR"/>
+        </w:rPr>
+        <w:t>]</w:t>
+      </w:r>
+      <w:r>
+        <w:rPr>
+          <w:lang w:bidi="fa-IR"/>
+        </w:rPr>
+        <w:t xml:space="preserve"> </w:t>
+      </w:r>
+    </w:p>
+    <w:p>
+      <w:pPr>
+        <w:jc w:val="both"/>
+        <w:rPr>
+          <w:lang w:bidi="fa-IR"/>
+        </w:rPr>
+      </w:pPr>
+    </w:p>
+    <w:p>
+      <w:pPr>
+        <w:jc w:val="both"/>
+        <w:rPr>
+          <w:b/>
+          <w:bCs/>
+          <w:lang w:bidi="fa-IR"/>
+        </w:rPr>
+      </w:pPr>
+      <w:r>
+        <w:rPr>
+          <w:b/>
+          <w:bCs/>
+          <w:lang w:bidi="fa-IR"/>
+        </w:rPr>
+        <w:t>4.3. Convivialité</w:t>
+      </w:r>
+    </w:p>
+    <w:p>
+      <w:pPr>
+        <w:jc w:val="both"/>
+        <w:rPr>
+          <w:b/>
+          <w:bCs/>
+          <w:lang w:bidi="fa-IR"/>
+        </w:rPr>
+      </w:pPr>
+    </w:p>
+    <w:p>
+      <w:pPr>
+        <w:ind w:left="705"/>
+        <w:jc w:val="both"/>
+        <w:rPr>
+          <w:lang w:bidi="fa-IR"/>
+        </w:rPr>
+      </w:pPr>
+      <w:r>
+        <w:rPr>
+          <w:lang w:bidi="fa-IR"/>
+        </w:rPr>
+        <w:t>4.3.1. L’interface utilisateur doit être claire, intuitive et facile à utiliser. [Essentielle]</w:t>
+      </w:r>
+    </w:p>
+    <w:p>
+      <w:pPr>
+        <w:ind w:left="705"/>
+        <w:jc w:val="both"/>
+        <w:rPr>
+          <w:lang w:bidi="fa-IR"/>
+        </w:rPr>
+      </w:pPr>
+    </w:p>
+    <w:p>
+      <w:pPr>
+        <w:ind w:left="705"/>
+        <w:jc w:val="both"/>
+        <w:rPr>
+          <w:lang w:bidi="fa-IR"/>
+        </w:rPr>
+      </w:pPr>
+      <w:r>
+        <w:rPr>
+          <w:lang w:bidi="fa-IR"/>
+        </w:rPr>
+        <w:t>4.3.</w:t>
+      </w:r>
+      <w:r>
+        <w:rPr>
+          <w:lang w:bidi="fa-IR"/>
+        </w:rPr>
+        <w:t>2</w:t>
+      </w:r>
+      <w:r>
+        <w:rPr>
+          <w:lang w:bidi="fa-IR"/>
+        </w:rPr>
+        <w:t>. Les messages d’erreur et de confirmation doivent être compréhensibles et explicites. [Essentielle]</w:t>
+      </w:r>
+      <w:r>
+        <w:rPr>
+          <w:lang w:bidi="fa-IR"/>
+        </w:rPr>
+        <w:t xml:space="preserve"> </w:t>
+      </w:r>
+    </w:p>
+    <w:p>
+      <w:pPr>
+        <w:ind w:left="705"/>
+        <w:jc w:val="both"/>
+        <w:rPr>
+          <w:lang w:bidi="fa-IR"/>
+        </w:rPr>
+      </w:pPr>
+    </w:p>
+    <w:p>
+      <w:pPr>
+        <w:ind w:left="705"/>
+        <w:jc w:val="both"/>
+        <w:rPr>
+          <w:lang w:bidi="fa-IR"/>
+        </w:rPr>
+      </w:pPr>
+      <w:r>
+        <w:rPr>
+          <w:lang w:bidi="fa-IR"/>
+        </w:rPr>
+        <w:lastRenderedPageBreak/>
+        <w:t>4.3.3. Le système doit être compatible avec différents appareils (ordinateur, tablette, téléphone) grâce à un design responsive. [</w:t>
+      </w:r>
+      <w:r>
+        <w:rPr>
+          <w:lang w:bidi="fa-IR"/>
+        </w:rPr>
+        <w:t>Souhaitable</w:t>
+      </w:r>
+      <w:r>
+        <w:rPr>
+          <w:lang w:bidi="fa-IR"/>
+        </w:rPr>
+        <w:t>]</w:t>
+      </w:r>
+      <w:r>
+        <w:rPr>
+          <w:lang w:bidi="fa-IR"/>
+        </w:rPr>
+        <w:t xml:space="preserve">  </w:t>
+      </w:r>
+    </w:p>
+    <w:p>
+      <w:pPr>
+        <w:jc w:val="both"/>
+        <w:rPr>
+          <w:lang w:bidi="fa-IR"/>
+        </w:rPr>
+      </w:pPr>
+    </w:p>
+    <w:p>
+      <w:pPr>
+        <w:jc w:val="both"/>
+        <w:rPr>
+          <w:b/>
+          <w:bCs/>
+          <w:lang w:bidi="fa-IR"/>
+        </w:rPr>
+      </w:pPr>
+      <w:r>
+        <w:rPr>
+          <w:b/>
+          <w:bCs/>
+          <w:lang w:bidi="fa-IR"/>
+        </w:rPr>
+        <w:t>4.4. Fiabilité</w:t>
+      </w:r>
+    </w:p>
+    <w:p>
+      <w:pPr>
+        <w:jc w:val="both"/>
+        <w:rPr>
+          <w:b/>
+          <w:bCs/>
+          <w:lang w:bidi="fa-IR"/>
+        </w:rPr>
+      </w:pPr>
+    </w:p>
+    <w:p>
+      <w:pPr>
+        <w:ind w:left="705"/>
+        <w:jc w:val="both"/>
+        <w:rPr>
+          <w:lang w:bidi="fa-IR"/>
+        </w:rPr>
+      </w:pPr>
+      <w:r>
+        <w:rPr>
+          <w:lang w:bidi="fa-IR"/>
+        </w:rPr>
+        <w:t>4.4.1. Le système doit être accessible et opérationnel pendant les heures de travail habituelles</w:t>
+      </w:r>
+      <w:r>
+        <w:rPr>
+          <w:lang w:bidi="fa-IR"/>
+        </w:rPr>
+        <w:t xml:space="preserve">. </w:t>
+      </w:r>
+      <w:r>
+        <w:rPr>
+          <w:lang w:bidi="fa-IR"/>
+        </w:rPr>
+        <w:t>[Essentielle]</w:t>
+      </w:r>
+    </w:p>
+    <w:p>
+      <w:pPr>
+        <w:ind w:left="705"/>
+        <w:jc w:val="both"/>
+        <w:rPr>
+          <w:lang w:bidi="fa-IR"/>
+        </w:rPr>
+      </w:pPr>
+    </w:p>
+    <w:p>
+      <w:pPr>
+        <w:ind w:left="705"/>
+        <w:jc w:val="both"/>
+        <w:rPr>
+          <w:lang w:bidi="fa-IR"/>
+        </w:rPr>
+      </w:pPr>
+      <w:r>
+        <w:rPr>
+          <w:lang w:bidi="fa-IR"/>
+        </w:rPr>
+        <w:t>4.4.2. Le système ne doit pas perdre ni corrompre les données lors d’une transaction</w:t>
+      </w:r>
+      <w:r>
+        <w:rPr>
+          <w:lang w:bidi="fa-IR"/>
+        </w:rPr>
+        <w:t xml:space="preserve">. </w:t>
+      </w:r>
+      <w:r>
+        <w:rPr>
+          <w:lang w:bidi="fa-IR"/>
+        </w:rPr>
+        <w:t>[Essentielle]</w:t>
+      </w:r>
+    </w:p>
+    <w:p>
+      <w:pPr>
+        <w:ind w:left="705"/>
+        <w:jc w:val="both"/>
+        <w:rPr>
+          <w:lang w:bidi="fa-IR"/>
+        </w:rPr>
+      </w:pPr>
+    </w:p>
+    <w:p>
+      <w:pPr>
+        <w:ind w:left="705"/>
+        <w:jc w:val="both"/>
+        <w:rPr>
+          <w:lang w:bidi="fa-IR"/>
+        </w:rPr>
+      </w:pPr>
+      <w:r>
+        <w:rPr>
+          <w:lang w:bidi="fa-IR"/>
+        </w:rPr>
+        <w:t>4.4.3. En cas d’erreur, le système doit gérer l’exception sans interrompre complètement le service. [</w:t>
+      </w:r>
+      <w:r>
+        <w:rPr>
+          <w:lang w:bidi="fa-IR"/>
+        </w:rPr>
+        <w:t>Souhaitable</w:t>
+      </w:r>
+      <w:r>
+        <w:rPr>
+          <w:lang w:bidi="fa-IR"/>
+        </w:rPr>
+        <w:t>]</w:t>
+      </w:r>
+    </w:p>
+    <w:p>
+      <w:pPr>
+        <w:jc w:val="both"/>
+        <w:rPr>
+          <w:lang w:bidi="fa-IR"/>
+        </w:rPr>
+      </w:pPr>
+    </w:p>
+    <w:p>
+      <w:pPr>
+        <w:jc w:val="both"/>
+        <w:rPr>
+          <w:b/>
+          <w:bCs/>
+          <w:lang w:bidi="fa-IR"/>
+        </w:rPr>
+      </w:pPr>
+      <w:r>
+        <w:rPr>
+          <w:b/>
+          <w:bCs/>
+          <w:lang w:bidi="fa-IR"/>
+        </w:rPr>
+        <w:t>4.5. Sécurité</w:t>
+      </w:r>
+    </w:p>
+    <w:p>
+      <w:pPr>
+        <w:jc w:val="both"/>
+        <w:rPr>
+          <w:b/>
+          <w:bCs/>
+          <w:lang w:bidi="fa-IR"/>
+        </w:rPr>
+      </w:pPr>
+    </w:p>
+    <w:p>
+      <w:pPr>
+        <w:ind w:left="705"/>
+        <w:jc w:val="both"/>
+        <w:rPr>
+          <w:lang w:bidi="fa-IR"/>
+        </w:rPr>
+      </w:pPr>
+      <w:r>
+        <w:rPr>
+          <w:lang w:bidi="fa-IR"/>
+        </w:rPr>
+        <w:t>4.5.1. Le système doit exiger une authentification pour accéder aux informations personnelles. [Essentielle]</w:t>
+      </w:r>
+    </w:p>
+    <w:p>
+      <w:pPr>
+        <w:ind w:left="705"/>
+        <w:jc w:val="both"/>
+        <w:rPr>
+          <w:lang w:bidi="fa-IR"/>
+        </w:rPr>
+      </w:pPr>
+    </w:p>
+    <w:p>
+      <w:pPr>
+        <w:ind w:left="705"/>
+        <w:jc w:val="both"/>
+        <w:rPr>
+          <w:lang w:bidi="fa-IR"/>
+        </w:rPr>
+      </w:pPr>
+      <w:r>
+        <w:rPr>
+          <w:lang w:bidi="fa-IR"/>
+        </w:rPr>
+        <w:t>4.5.</w:t>
+      </w:r>
+      <w:r>
+        <w:rPr>
+          <w:lang w:bidi="fa-IR"/>
+        </w:rPr>
+        <w:t>2</w:t>
+      </w:r>
+      <w:r>
+        <w:rPr>
+          <w:lang w:bidi="fa-IR"/>
+        </w:rPr>
+        <w:t>. Les routes administratives doivent être protégées et accessibles uniquement aux administrateurs autorisés. [Essentielle]</w:t>
+      </w:r>
+    </w:p>
+    <w:p>
+      <w:pPr>
+        <w:ind w:left="705"/>
+        <w:jc w:val="both"/>
+        <w:rPr>
+          <w:lang w:bidi="fa-IR"/>
+        </w:rPr>
+      </w:pPr>
+    </w:p>
+    <w:p>
+      <w:pPr>
+        <w:ind w:left="705"/>
+        <w:jc w:val="both"/>
+        <w:rPr>
+          <w:lang w:bidi="fa-IR"/>
+        </w:rPr>
+      </w:pPr>
+      <w:r>
+        <w:rPr>
+          <w:lang w:bidi="fa-IR"/>
+        </w:rPr>
+        <w:t>4.5.</w:t>
+      </w:r>
+      <w:r>
+        <w:rPr>
+          <w:lang w:bidi="fa-IR"/>
+        </w:rPr>
+        <w:t>3</w:t>
+      </w:r>
+      <w:r>
+        <w:rPr>
+          <w:lang w:bidi="fa-IR"/>
+        </w:rPr>
+        <w:t>. Le système doit valider les données côté serveur afin d’éviter les accès non autorisés ou les injections malveillantes. [Essentielle]</w:t>
+      </w:r>
+    </w:p>
+    <w:p>
+      <w:pPr>
+        <w:ind w:left="705"/>
+        <w:jc w:val="both"/>
+        <w:rPr>
+          <w:lang w:bidi="fa-IR"/>
+        </w:rPr>
+      </w:pPr>
+    </w:p>
+    <w:p>
+      <w:pPr>
+        <w:ind w:left="705"/>
+        <w:jc w:val="both"/>
+        <w:rPr>
+          <w:lang w:bidi="fa-IR"/>
+        </w:rPr>
+      </w:pPr>
+      <w:r>
+        <w:rPr>
+          <w:lang w:bidi="fa-IR"/>
+        </w:rPr>
+        <w:t>4.5.</w:t>
+      </w:r>
+      <w:r>
+        <w:rPr>
+          <w:lang w:bidi="fa-IR"/>
+        </w:rPr>
+        <w:t>4</w:t>
+      </w:r>
+      <w:r>
+        <w:rPr>
+          <w:lang w:bidi="fa-IR"/>
+        </w:rPr>
+        <w:t>. Les mots de passe doivent être stockés de manière sécurisée dans la base de données. [</w:t>
+      </w:r>
+      <w:r>
+        <w:rPr>
+          <w:lang w:bidi="fa-IR"/>
+        </w:rPr>
+        <w:t>Souhaitable</w:t>
+      </w:r>
+      <w:r>
+        <w:rPr>
+          <w:lang w:bidi="fa-IR"/>
+        </w:rPr>
+        <w:t>]</w:t>
+      </w:r>
+    </w:p>
+    <w:p>
+      <w:pPr>
+        <w:jc w:val="both"/>
+        <w:rPr>
+          <w:lang w:val="fr-CA" w:bidi="fa-IR"/>
+        </w:rPr>
+      </w:pPr>
+    </w:p>
+    <w:p>
+      <w:pPr>
+        <w:rPr>
+          <w:lang w:val="fr-CA" w:bidi="fa-IR"/>
+        </w:rPr>
+      </w:pPr>
+      <w:r>
+        <w:rPr>
+          <w:lang w:val="fr-CA" w:bidi="fa-IR"/>
+        </w:rPr>
+        <w:br w:type="page"/>
+      </w:r>
+    </w:p>
+    <w:p>
+      <w:pPr>
+        <w:pStyle w:val="Titre1"/>
+        <w:numPr>
+          <w:ilvl w:val="0"/>
+          <w:numId w:val="1"/>
+        </w:numPr>
       </w:pPr>
       <w:bookmarkStart w:id="14" w:name="_Toc221803405"/>
       <w:r>
+        <w:lastRenderedPageBreak/>
         <w:t>Portée</w:t>
       </w:r>
       <w:bookmarkEnd w:id="14"/>
@@ -5265,9 +6106,9 @@
       </w:r>
       <w:r>
         <w:rPr>
-          <w:rStyle w:val="FootnoteReference"/>
-        </w:rPr>
-        <w:footnoteReference w:id="2"/>
+          <w:rStyle w:val="Appelnotedebasdep"/>
+        </w:rPr>
+        <w:footnoteReference w:id="4"/>
       </w:r>
     </w:p>
     <w:p>
@@ -5288,7 +6129,7 @@
     </w:p>
     <w:p>
       <w:pPr>
-        <w:pStyle w:val="ListParagraph"/>
+        <w:pStyle w:val="Paragraphedeliste"/>
         <w:numPr>
           <w:ilvl w:val="0"/>
           <w:numId w:val="4"/>
@@ -5332,7 +6173,7 @@
     </w:p>
     <w:p>
       <w:pPr>
-        <w:pStyle w:val="ListParagraph"/>
+        <w:pStyle w:val="Paragraphedeliste"/>
         <w:numPr>
           <w:ilvl w:val="0"/>
           <w:numId w:val="4"/>
@@ -5345,7 +6186,7 @@
     </w:p>
     <w:p>
       <w:pPr>
-        <w:pStyle w:val="ListParagraph"/>
+        <w:pStyle w:val="Paragraphedeliste"/>
         <w:numPr>
           <w:ilvl w:val="1"/>
           <w:numId w:val="4"/>
@@ -5379,7 +6220,7 @@
     </w:p>
     <w:p>
       <w:pPr>
-        <w:pStyle w:val="ListParagraph"/>
+        <w:pStyle w:val="Paragraphedeliste"/>
         <w:numPr>
           <w:ilvl w:val="1"/>
           <w:numId w:val="4"/>
@@ -5413,7 +6254,7 @@
     </w:p>
     <w:p>
       <w:pPr>
-        <w:pStyle w:val="ListParagraph"/>
+        <w:pStyle w:val="Paragraphedeliste"/>
         <w:numPr>
           <w:ilvl w:val="1"/>
           <w:numId w:val="4"/>
@@ -5438,7 +6279,7 @@
     </w:p>
     <w:p>
       <w:pPr>
-        <w:pStyle w:val="ListParagraph"/>
+        <w:pStyle w:val="Paragraphedeliste"/>
         <w:numPr>
           <w:ilvl w:val="1"/>
           <w:numId w:val="4"/>
@@ -5451,7 +6292,7 @@
     </w:p>
     <w:p>
       <w:pPr>
-        <w:pStyle w:val="ListParagraph"/>
+        <w:pStyle w:val="Paragraphedeliste"/>
         <w:numPr>
           <w:ilvl w:val="1"/>
           <w:numId w:val="4"/>
@@ -5473,7 +6314,7 @@
     </w:p>
     <w:p>
       <w:pPr>
-        <w:pStyle w:val="ListParagraph"/>
+        <w:pStyle w:val="Paragraphedeliste"/>
         <w:numPr>
           <w:ilvl w:val="1"/>
           <w:numId w:val="4"/>
@@ -5489,7 +6330,7 @@
     </w:p>
     <w:p>
       <w:pPr>
-        <w:pStyle w:val="ListParagraph"/>
+        <w:pStyle w:val="Paragraphedeliste"/>
         <w:numPr>
           <w:ilvl w:val="0"/>
           <w:numId w:val="4"/>
@@ -5502,7 +6343,7 @@
     </w:p>
     <w:p>
       <w:pPr>
-        <w:pStyle w:val="ListParagraph"/>
+        <w:pStyle w:val="Paragraphedeliste"/>
         <w:numPr>
           <w:ilvl w:val="1"/>
           <w:numId w:val="4"/>
@@ -5515,7 +6356,7 @@
     </w:p>
     <w:p>
       <w:pPr>
-        <w:pStyle w:val="ListParagraph"/>
+        <w:pStyle w:val="Paragraphedeliste"/>
         <w:numPr>
           <w:ilvl w:val="1"/>
           <w:numId w:val="4"/>
@@ -5528,7 +6369,7 @@
     </w:p>
     <w:p>
       <w:pPr>
-        <w:pStyle w:val="ListParagraph"/>
+        <w:pStyle w:val="Paragraphedeliste"/>
         <w:numPr>
           <w:ilvl w:val="1"/>
           <w:numId w:val="4"/>
@@ -5541,7 +6382,7 @@
     </w:p>
     <w:p>
       <w:pPr>
-        <w:pStyle w:val="ListParagraph"/>
+        <w:pStyle w:val="Paragraphedeliste"/>
         <w:numPr>
           <w:ilvl w:val="2"/>
           <w:numId w:val="4"/>
@@ -5554,7 +6395,7 @@
     </w:p>
     <w:p>
       <w:pPr>
-        <w:pStyle w:val="ListParagraph"/>
+        <w:pStyle w:val="Paragraphedeliste"/>
         <w:numPr>
           <w:ilvl w:val="0"/>
           <w:numId w:val="4"/>
@@ -5567,7 +6408,7 @@
     </w:p>
     <w:p>
       <w:pPr>
-        <w:pStyle w:val="ListParagraph"/>
+        <w:pStyle w:val="Paragraphedeliste"/>
         <w:numPr>
           <w:ilvl w:val="1"/>
           <w:numId w:val="4"/>
@@ -5583,7 +6424,7 @@
     </w:p>
     <w:p>
       <w:pPr>
-        <w:pStyle w:val="ListParagraph"/>
+        <w:pStyle w:val="Paragraphedeliste"/>
         <w:numPr>
           <w:ilvl w:val="1"/>
           <w:numId w:val="4"/>
@@ -5596,7 +6437,7 @@
     </w:p>
     <w:p>
       <w:pPr>
-        <w:pStyle w:val="ListParagraph"/>
+        <w:pStyle w:val="Paragraphedeliste"/>
         <w:numPr>
           <w:ilvl w:val="0"/>
           <w:numId w:val="4"/>
@@ -5609,7 +6450,7 @@
     </w:p>
     <w:p>
       <w:pPr>
-        <w:pStyle w:val="ListParagraph"/>
+        <w:pStyle w:val="Paragraphedeliste"/>
         <w:numPr>
           <w:ilvl w:val="1"/>
           <w:numId w:val="4"/>
@@ -5634,7 +6475,7 @@
     </w:p>
     <w:p>
       <w:pPr>
-        <w:pStyle w:val="ListParagraph"/>
+        <w:pStyle w:val="Paragraphedeliste"/>
         <w:numPr>
           <w:ilvl w:val="1"/>
           <w:numId w:val="4"/>
@@ -5647,7 +6488,7 @@
     </w:p>
     <w:p>
       <w:pPr>
-        <w:pStyle w:val="ListParagraph"/>
+        <w:pStyle w:val="Paragraphedeliste"/>
         <w:numPr>
           <w:ilvl w:val="1"/>
           <w:numId w:val="4"/>
@@ -5668,12 +6509,13 @@
         <w:jc w:val="both"/>
       </w:pPr>
       <w:r>
+        <w:lastRenderedPageBreak/>
         <w:t>Contraintes</w:t>
       </w:r>
     </w:p>
     <w:p>
       <w:pPr>
-        <w:pStyle w:val="ListParagraph"/>
+        <w:pStyle w:val="Paragraphedeliste"/>
         <w:numPr>
           <w:ilvl w:val="0"/>
           <w:numId w:val="4"/>
@@ -5686,7 +6528,7 @@
     </w:p>
     <w:p>
       <w:pPr>
-        <w:pStyle w:val="ListParagraph"/>
+        <w:pStyle w:val="Paragraphedeliste"/>
         <w:numPr>
           <w:ilvl w:val="1"/>
           <w:numId w:val="4"/>
@@ -5705,7 +6547,7 @@
     </w:p>
     <w:p>
       <w:pPr>
-        <w:pStyle w:val="ListParagraph"/>
+        <w:pStyle w:val="Paragraphedeliste"/>
         <w:numPr>
           <w:ilvl w:val="1"/>
           <w:numId w:val="4"/>
@@ -5718,7 +6560,7 @@
     </w:p>
     <w:p>
       <w:pPr>
-        <w:pStyle w:val="ListParagraph"/>
+        <w:pStyle w:val="Paragraphedeliste"/>
         <w:numPr>
           <w:ilvl w:val="1"/>
           <w:numId w:val="4"/>
@@ -5749,7 +6591,7 @@
     </w:p>
     <w:p>
       <w:pPr>
-        <w:pStyle w:val="ListParagraph"/>
+        <w:pStyle w:val="Paragraphedeliste"/>
         <w:numPr>
           <w:ilvl w:val="1"/>
           <w:numId w:val="4"/>
@@ -5780,7 +6622,7 @@
     </w:p>
     <w:p>
       <w:pPr>
-        <w:pStyle w:val="ListParagraph"/>
+        <w:pStyle w:val="Paragraphedeliste"/>
         <w:numPr>
           <w:ilvl w:val="1"/>
           <w:numId w:val="4"/>
@@ -5835,7 +6677,7 @@
     </w:p>
     <w:p>
       <w:pPr>
-        <w:pStyle w:val="ListParagraph"/>
+        <w:pStyle w:val="Paragraphedeliste"/>
         <w:numPr>
           <w:ilvl w:val="1"/>
           <w:numId w:val="4"/>
@@ -5894,7 +6736,7 @@
     </w:p>
     <w:p>
       <w:pPr>
-        <w:pStyle w:val="ListParagraph"/>
+        <w:pStyle w:val="Paragraphedeliste"/>
         <w:numPr>
           <w:ilvl w:val="0"/>
           <w:numId w:val="4"/>
@@ -5916,10 +6758,11 @@
         </w:rPr>
         <w:br w:type="page"/>
       </w:r>
-    </w:p>
-    <w:p>
-      <w:pPr>
-        <w:pStyle w:val="Heading1"/>
+      <w:bookmarkStart w:id="15" w:name="_Toc221803406"/>
+    </w:p>
+    <w:p>
+      <w:pPr>
+        <w:pStyle w:val="Titre1"/>
         <w:numPr>
           <w:ilvl w:val="0"/>
           <w:numId w:val="1"/>
@@ -5928,11 +6771,11 @@
           <w:rFonts w:asciiTheme="minorHAnsi" w:hAnsiTheme="minorHAnsi"/>
         </w:rPr>
       </w:pPr>
-      <w:bookmarkStart w:id="15" w:name="_Toc221803406"/>
       <w:r>
         <w:rPr>
           <w:rFonts w:asciiTheme="minorHAnsi" w:hAnsiTheme="minorHAnsi"/>
         </w:rPr>
+        <w:lastRenderedPageBreak/>
         <w:t>Modèle de la base de données</w:t>
       </w:r>
       <w:bookmarkEnd w:id="15"/>
@@ -5952,7 +6795,7 @@
           <w:noProof/>
         </w:rPr>
         <w:drawing>
-          <wp:inline distT="0" distB="0" distL="0" distR="0" wp14:anchorId="5946CD70" wp14:editId="29CF2144">
+          <wp:inline distT="0" distB="0" distL="0" distR="0" wp14:anchorId="5946CD70" wp14:editId="7CA27C59">
             <wp:extent cx="5486400" cy="2255520"/>
             <wp:effectExtent l="0" t="0" r="0" b="0"/>
             <wp:docPr id="1149502962" name="Image 1"/>
@@ -6003,7 +6846,7 @@
           <w:noProof/>
         </w:rPr>
         <w:drawing>
-          <wp:inline distT="0" distB="0" distL="0" distR="0" wp14:anchorId="275A6080" wp14:editId="403E1C44">
+          <wp:inline distT="0" distB="0" distL="0" distR="0" wp14:anchorId="275A6080" wp14:editId="7072BBFB">
             <wp:extent cx="5486400" cy="3323590"/>
             <wp:effectExtent l="0" t="0" r="0" b="0"/>
             <wp:docPr id="238746701" name="Image 2"/>
@@ -6061,6 +6904,7 @@
           <w:b/>
           <w:bCs/>
         </w:rPr>
+        <w:lastRenderedPageBreak/>
         <w:t>Légende</w:t>
       </w:r>
       <w:r>
@@ -6080,7 +6924,7 @@
     </w:p>
     <w:p>
       <w:pPr>
-        <w:pStyle w:val="ListParagraph"/>
+        <w:pStyle w:val="Paragraphedeliste"/>
         <w:numPr>
           <w:ilvl w:val="0"/>
           <w:numId w:val="5"/>
@@ -6144,7 +6988,7 @@
     </w:p>
     <w:p>
       <w:pPr>
-        <w:pStyle w:val="ListParagraph"/>
+        <w:pStyle w:val="Paragraphedeliste"/>
         <w:numPr>
           <w:ilvl w:val="0"/>
           <w:numId w:val="5"/>
@@ -6180,7 +7024,7 @@
     </w:p>
     <w:p>
       <w:pPr>
-        <w:pStyle w:val="ListParagraph"/>
+        <w:pStyle w:val="Paragraphedeliste"/>
         <w:numPr>
           <w:ilvl w:val="0"/>
           <w:numId w:val="5"/>
@@ -6294,7 +7138,7 @@
     </w:p>
     <w:p>
       <w:pPr>
-        <w:pStyle w:val="ListParagraph"/>
+        <w:pStyle w:val="Paragraphedeliste"/>
         <w:numPr>
           <w:ilvl w:val="0"/>
           <w:numId w:val="5"/>
@@ -6372,7 +7216,7 @@
     </w:p>
     <w:p>
       <w:pPr>
-        <w:pStyle w:val="ListParagraph"/>
+        <w:pStyle w:val="Paragraphedeliste"/>
         <w:numPr>
           <w:ilvl w:val="0"/>
           <w:numId w:val="5"/>
@@ -6485,7 +7329,7 @@
     </w:p>
     <w:p>
       <w:pPr>
-        <w:pStyle w:val="Heading1"/>
+        <w:pStyle w:val="Titre1"/>
         <w:numPr>
           <w:ilvl w:val="0"/>
           <w:numId w:val="1"/>
@@ -6499,6 +7343,7 @@
         <w:rPr>
           <w:rFonts w:asciiTheme="minorHAnsi" w:hAnsiTheme="minorHAnsi"/>
         </w:rPr>
+        <w:lastRenderedPageBreak/>
         <w:t>Maquettes du site Web</w:t>
       </w:r>
       <w:bookmarkEnd w:id="16"/>
@@ -6545,6 +7390,7 @@
         <w:rPr>
           <w:noProof/>
         </w:rPr>
+        <w:lastRenderedPageBreak/>
         <w:drawing>
           <wp:inline distT="0" distB="0" distL="0" distR="0" wp14:anchorId="64DD4DB0" wp14:editId="15E20059">
             <wp:extent cx="5496321" cy="7994650"/>
@@ -6591,6 +7437,7 @@
         <w:rPr>
           <w:noProof/>
         </w:rPr>
+        <w:lastRenderedPageBreak/>
         <w:drawing>
           <wp:inline distT="0" distB="0" distL="0" distR="0" wp14:anchorId="5CF5B45F" wp14:editId="08480396">
             <wp:extent cx="5533038" cy="6695440"/>
@@ -6637,6 +7484,7 @@
         <w:rPr>
           <w:noProof/>
         </w:rPr>
+        <w:lastRenderedPageBreak/>
         <w:drawing>
           <wp:inline distT="0" distB="0" distL="0" distR="0" wp14:anchorId="75DA0322" wp14:editId="1C16CA46">
             <wp:extent cx="5473700" cy="6623637"/>
@@ -6683,6 +7531,7 @@
         <w:rPr>
           <w:noProof/>
         </w:rPr>
+        <w:lastRenderedPageBreak/>
         <w:drawing>
           <wp:inline distT="0" distB="0" distL="0" distR="0" wp14:anchorId="32A629F6" wp14:editId="7F773AC6">
             <wp:extent cx="5475288" cy="10950575"/>
@@ -6729,6 +7578,7 @@
         <w:rPr>
           <w:noProof/>
         </w:rPr>
+        <w:lastRenderedPageBreak/>
         <w:drawing>
           <wp:inline distT="0" distB="0" distL="0" distR="0" wp14:anchorId="08114F82" wp14:editId="2BD402AC">
             <wp:extent cx="5473700" cy="6623637"/>
@@ -6798,7 +7648,7 @@
       <w:sdtContent>
         <w:p>
           <w:pPr>
-            <w:pStyle w:val="Heading1"/>
+            <w:pStyle w:val="Titre1"/>
             <w:numPr>
               <w:ilvl w:val="0"/>
               <w:numId w:val="1"/>
@@ -6818,7 +7668,7 @@
           <w:sdtContent>
             <w:p>
               <w:pPr>
-                <w:pStyle w:val="Bibliography"/>
+                <w:pStyle w:val="Bibliographie"/>
                 <w:ind w:left="720" w:hanging="720"/>
                 <w:rPr>
                   <w:noProof/>
@@ -6856,7 +7706,7 @@
             </w:p>
             <w:p>
               <w:pPr>
-                <w:pStyle w:val="Bibliography"/>
+                <w:pStyle w:val="Bibliographie"/>
                 <w:ind w:left="720" w:hanging="720"/>
                 <w:rPr>
                   <w:noProof/>
@@ -6874,13 +7724,13 @@
                   <w:iCs/>
                   <w:noProof/>
                 </w:rPr>
-                <w:t>Quelles sont les exigences fonctionnelles : exemples et modèles</w:t>
+                <w:t>Exigences fonctionnelles et non fonctionnelles (avec exemples)</w:t>
               </w:r>
               <w:r>
                 <w:rPr>
                   <w:noProof/>
                 </w:rPr>
-                <w:t>. Récupéré sur Visure: https://visuresolutions.com/fr/alm-guide/functional-requirements/</w:t>
+                <w:t>. Récupéré sur Visure: https://visuresolutions.com/fr/guide-d%27alm/exigences-fonctionnelles-vs-non-fonctionnelles/</w:t>
               </w:r>
             </w:p>
             <w:p>
@@ -6933,34 +7783,34 @@
 <w:ftr xmlns:wpc="http://schemas.microsoft.com/office/word/2010/wordprocessingCanvas" xmlns:cx="http://schemas.microsoft.com/office/drawing/2014/chartex" xmlns:cx1="http://schemas.microsoft.com/office/drawing/2015/9/8/chartex" xmlns:cx2="http://schemas.microsoft.com/office/drawing/2015/10/21/chartex" xmlns:cx3="http://schemas.microsoft.com/office/drawing/2016/5/9/chartex" xmlns:cx4="http://schemas.microsoft.com/office/drawing/2016/5/10/chartex" xmlns:cx5="http://schemas.microsoft.com/office/drawing/2016/5/11/chartex" xmlns:cx6="http://schemas.microsoft.com/office/drawing/2016/5/12/chartex" xmlns:cx7="http://schemas.microsoft.com/office/drawing/2016/5/13/chartex" xmlns:cx8="http://schemas.microsoft.com/office/drawing/2016/5/14/chartex" xmlns:mc="http://schemas.openxmlformats.org/markup-compatibility/2006" xmlns:aink="http://schemas.microsoft.com/office/drawing/2016/ink" xmlns:am3d="http://schemas.microsoft.com/office/drawing/2017/model3d" xmlns:o="urn:schemas-microsoft-com:office:office" xmlns:oel="http://schemas.microsoft.com/office/2019/extlst" xmlns:r="http://schemas.openxmlformats.org/officeDocument/2006/relationships" xmlns:m="http://schemas.openxmlformats.org/officeDocument/2006/math" xmlns:v="urn:schemas-microsoft-com:vml" xmlns:wp14="http://schemas.microsoft.com/office/word/2010/wordprocessingDrawing" xmlns:wp="http://schemas.openxmlformats.org/drawingml/2006/wordprocessingDrawing" xmlns:w10="urn:schemas-microsoft-com:office:word" xmlns:w="http://schemas.openxmlformats.org/wordprocessingml/2006/main" xmlns:w14="http://schemas.microsoft.com/office/word/2010/wordml" xmlns:w15="http://schemas.microsoft.com/office/word/2012/wordml" xmlns:w16cex="http://schemas.microsoft.com/office/word/2018/wordml/cex" xmlns:w16cid="http://schemas.microsoft.com/office/word/2016/wordml/cid" xmlns:w16="http://schemas.microsoft.com/office/word/2018/wordml" xmlns:w16du="http://schemas.microsoft.com/office/word/2023/wordml/word16du" xmlns:w16sdtdh="http://schemas.microsoft.com/office/word/2020/wordml/sdtdatahash" xmlns:w16sdtfl="http://schemas.microsoft.com/office/word/2024/wordml/sdtformatlock" xmlns:w16se="http://schemas.microsoft.com/office/word/2015/wordml/symex" xmlns:wpg="http://schemas.microsoft.com/office/word/2010/wordprocessingGroup" xmlns:wpi="http://schemas.microsoft.com/office/word/2010/wordprocessingInk" xmlns:wne="http://schemas.microsoft.com/office/word/2006/wordml" xmlns:wps="http://schemas.microsoft.com/office/word/2010/wordprocessingShape" mc:Ignorable="w14 w15 w16se w16cid w16 w16cex w16sdtdh w16sdtfl w16du wp14">
   <w:p>
     <w:pPr>
-      <w:pStyle w:val="Footer"/>
+      <w:pStyle w:val="Pieddepage"/>
       <w:framePr w:wrap="none" w:vAnchor="text" w:hAnchor="margin" w:xAlign="right" w:y="1"/>
       <w:rPr>
-        <w:rStyle w:val="PageNumber"/>
+        <w:rStyle w:val="Numrodepage"/>
       </w:rPr>
     </w:pPr>
     <w:r>
       <w:rPr>
-        <w:rStyle w:val="PageNumber"/>
+        <w:rStyle w:val="Numrodepage"/>
       </w:rPr>
       <w:fldChar w:fldCharType="begin"/>
     </w:r>
     <w:r>
       <w:rPr>
-        <w:rStyle w:val="PageNumber"/>
+        <w:rStyle w:val="Numrodepage"/>
       </w:rPr>
       <w:instrText xml:space="preserve">PAGE  </w:instrText>
     </w:r>
     <w:r>
       <w:rPr>
-        <w:rStyle w:val="PageNumber"/>
+        <w:rStyle w:val="Numrodepage"/>
       </w:rPr>
       <w:fldChar w:fldCharType="end"/>
     </w:r>
   </w:p>
   <w:p>
     <w:pPr>
-      <w:pStyle w:val="Footer"/>
+      <w:pStyle w:val="Pieddepage"/>
       <w:ind w:right="360"/>
     </w:pPr>
   </w:p>
@@ -6971,47 +7821,47 @@
 <w:ftr xmlns:wpc="http://schemas.microsoft.com/office/word/2010/wordprocessingCanvas" xmlns:cx="http://schemas.microsoft.com/office/drawing/2014/chartex" xmlns:cx1="http://schemas.microsoft.com/office/drawing/2015/9/8/chartex" xmlns:cx2="http://schemas.microsoft.com/office/drawing/2015/10/21/chartex" xmlns:cx3="http://schemas.microsoft.com/office/drawing/2016/5/9/chartex" xmlns:cx4="http://schemas.microsoft.com/office/drawing/2016/5/10/chartex" xmlns:cx5="http://schemas.microsoft.com/office/drawing/2016/5/11/chartex" xmlns:cx6="http://schemas.microsoft.com/office/drawing/2016/5/12/chartex" xmlns:cx7="http://schemas.microsoft.com/office/drawing/2016/5/13/chartex" xmlns:cx8="http://schemas.microsoft.com/office/drawing/2016/5/14/chartex" xmlns:mc="http://schemas.openxmlformats.org/markup-compatibility/2006" xmlns:aink="http://schemas.microsoft.com/office/drawing/2016/ink" xmlns:am3d="http://schemas.microsoft.com/office/drawing/2017/model3d" xmlns:o="urn:schemas-microsoft-com:office:office" xmlns:oel="http://schemas.microsoft.com/office/2019/extlst" xmlns:r="http://schemas.openxmlformats.org/officeDocument/2006/relationships" xmlns:m="http://schemas.openxmlformats.org/officeDocument/2006/math" xmlns:v="urn:schemas-microsoft-com:vml" xmlns:wp14="http://schemas.microsoft.com/office/word/2010/wordprocessingDrawing" xmlns:wp="http://schemas.openxmlformats.org/drawingml/2006/wordprocessingDrawing" xmlns:w10="urn:schemas-microsoft-com:office:word" xmlns:w="http://schemas.openxmlformats.org/wordprocessingml/2006/main" xmlns:w14="http://schemas.microsoft.com/office/word/2010/wordml" xmlns:w15="http://schemas.microsoft.com/office/word/2012/wordml" xmlns:w16cex="http://schemas.microsoft.com/office/word/2018/wordml/cex" xmlns:w16cid="http://schemas.microsoft.com/office/word/2016/wordml/cid" xmlns:w16="http://schemas.microsoft.com/office/word/2018/wordml" xmlns:w16du="http://schemas.microsoft.com/office/word/2023/wordml/word16du" xmlns:w16sdtdh="http://schemas.microsoft.com/office/word/2020/wordml/sdtdatahash" xmlns:w16sdtfl="http://schemas.microsoft.com/office/word/2024/wordml/sdtformatlock" xmlns:w16se="http://schemas.microsoft.com/office/word/2015/wordml/symex" xmlns:wpg="http://schemas.microsoft.com/office/word/2010/wordprocessingGroup" xmlns:wpi="http://schemas.microsoft.com/office/word/2010/wordprocessingInk" xmlns:wne="http://schemas.microsoft.com/office/word/2006/wordml" xmlns:wps="http://schemas.microsoft.com/office/word/2010/wordprocessingShape" mc:Ignorable="w14 w15 w16se w16cid w16 w16cex w16sdtdh w16sdtfl w16du wp14">
   <w:p>
     <w:pPr>
-      <w:pStyle w:val="Footer"/>
+      <w:pStyle w:val="Pieddepage"/>
       <w:framePr w:wrap="none" w:vAnchor="text" w:hAnchor="margin" w:xAlign="right" w:y="1"/>
       <w:rPr>
-        <w:rStyle w:val="PageNumber"/>
+        <w:rStyle w:val="Numrodepage"/>
       </w:rPr>
     </w:pPr>
     <w:r>
       <w:rPr>
-        <w:rStyle w:val="PageNumber"/>
+        <w:rStyle w:val="Numrodepage"/>
       </w:rPr>
       <w:fldChar w:fldCharType="begin"/>
     </w:r>
     <w:r>
       <w:rPr>
-        <w:rStyle w:val="PageNumber"/>
+        <w:rStyle w:val="Numrodepage"/>
       </w:rPr>
       <w:instrText xml:space="preserve">PAGE  </w:instrText>
     </w:r>
     <w:r>
       <w:rPr>
-        <w:rStyle w:val="PageNumber"/>
+        <w:rStyle w:val="Numrodepage"/>
       </w:rPr>
       <w:fldChar w:fldCharType="separate"/>
     </w:r>
     <w:r>
       <w:rPr>
-        <w:rStyle w:val="PageNumber"/>
+        <w:rStyle w:val="Numrodepage"/>
         <w:noProof/>
       </w:rPr>
       <w:t>19</w:t>
     </w:r>
     <w:r>
       <w:rPr>
-        <w:rStyle w:val="PageNumber"/>
+        <w:rStyle w:val="Numrodepage"/>
       </w:rPr>
       <w:fldChar w:fldCharType="end"/>
     </w:r>
   </w:p>
   <w:p>
     <w:pPr>
-      <w:pStyle w:val="Footer"/>
+      <w:pStyle w:val="Pieddepage"/>
       <w:ind w:right="360"/>
     </w:pPr>
   </w:p>
@@ -7037,14 +7887,14 @@
   <w:footnote w:id="1">
     <w:p>
       <w:pPr>
-        <w:pStyle w:val="FootnoteText"/>
-        <w:rPr>
-          <w:lang w:val="fr-CA"/>
-        </w:rPr>
-      </w:pPr>
-      <w:r>
-        <w:rPr>
-          <w:rStyle w:val="FootnoteReference"/>
+        <w:pStyle w:val="Notedebasdepage"/>
+        <w:rPr>
+          <w:lang w:val="fr-CA"/>
+        </w:rPr>
+      </w:pPr>
+      <w:r>
+        <w:rPr>
+          <w:rStyle w:val="Appelnotedebasdep"/>
         </w:rPr>
         <w:footnoteRef/>
       </w:r>
@@ -7112,18 +7962,125 @@
   <w:footnote w:id="2">
     <w:p>
       <w:pPr>
-        <w:pStyle w:val="FootnoteText"/>
-        <w:rPr>
-          <w:lang w:val="fr-CA"/>
-        </w:rPr>
-      </w:pPr>
-      <w:r>
-        <w:rPr>
-          <w:rStyle w:val="FootnoteReference"/>
+        <w:pStyle w:val="Notedebasdepage"/>
+        <w:rPr>
+          <w:lang w:val="en-US"/>
+        </w:rPr>
+      </w:pPr>
+      <w:r>
+        <w:rPr>
+          <w:rStyle w:val="Appelnotedebasdep"/>
         </w:rPr>
         <w:footnoteRef/>
       </w:r>
       <w:r>
+        <w:rPr>
+          <w:lang w:val="en-US"/>
+        </w:rPr>
+        <w:t xml:space="preserve"> </w:t>
+      </w:r>
+      <w:sdt>
+        <w:sdtPr>
+          <w:id w:val="-2000109968"/>
+          <w:citation/>
+        </w:sdtPr>
+        <w:sdtContent>
+          <w:r>
+            <w:fldChar w:fldCharType="begin"/>
+          </w:r>
+          <w:r>
+            <w:rPr>
+              <w:lang w:val="en-US"/>
+            </w:rPr>
+            <w:instrText xml:space="preserve"> CITATION Visure \l 3084 </w:instrText>
+          </w:r>
+          <w:r>
+            <w:fldChar w:fldCharType="separate"/>
+          </w:r>
+          <w:r>
+            <w:rPr>
+              <w:noProof/>
+              <w:lang w:val="en-US"/>
+            </w:rPr>
+            <w:t>(Visure, s.d.)</w:t>
+          </w:r>
+          <w:r>
+            <w:fldChar w:fldCharType="end"/>
+          </w:r>
+        </w:sdtContent>
+      </w:sdt>
+    </w:p>
+  </w:footnote>
+  <w:footnote w:id="3">
+    <w:p>
+      <w:pPr>
+        <w:pStyle w:val="Notedebasdepage"/>
+        <w:rPr>
+          <w:lang w:val="en-US"/>
+        </w:rPr>
+      </w:pPr>
+      <w:r>
+        <w:rPr>
+          <w:rStyle w:val="Appelnotedebasdep"/>
+        </w:rPr>
+        <w:footnoteRef/>
+      </w:r>
+      <w:r>
+        <w:rPr>
+          <w:lang w:val="en-US"/>
+        </w:rPr>
+        <w:t xml:space="preserve"> </w:t>
+      </w:r>
+      <w:sdt>
+        <w:sdtPr>
+          <w:id w:val="143865504"/>
+          <w:citation/>
+        </w:sdtPr>
+        <w:sdtContent>
+          <w:r>
+            <w:fldChar w:fldCharType="begin"/>
+          </w:r>
+          <w:r>
+            <w:rPr>
+              <w:lang w:val="en-US"/>
+            </w:rPr>
+            <w:instrText xml:space="preserve"> CITATION Visure \l 3084 </w:instrText>
+          </w:r>
+          <w:r>
+            <w:fldChar w:fldCharType="separate"/>
+          </w:r>
+          <w:r>
+            <w:rPr>
+              <w:noProof/>
+              <w:lang w:val="en-US"/>
+            </w:rPr>
+            <w:t>(Visure, s.d.)</w:t>
+          </w:r>
+          <w:r>
+            <w:fldChar w:fldCharType="end"/>
+          </w:r>
+        </w:sdtContent>
+      </w:sdt>
+    </w:p>
+  </w:footnote>
+  <w:footnote w:id="4">
+    <w:p>
+      <w:pPr>
+        <w:pStyle w:val="Notedebasdepage"/>
+        <w:rPr>
+          <w:lang w:val="en-US"/>
+        </w:rPr>
+      </w:pPr>
+      <w:r>
+        <w:rPr>
+          <w:rStyle w:val="Appelnotedebasdep"/>
+        </w:rPr>
+        <w:footnoteRef/>
+      </w:r>
+      <w:r>
+        <w:rPr>
+          <w:lang w:val="en-US"/>
+        </w:rPr>
         <w:t xml:space="preserve"> </w:t>
       </w:r>
       <w:sdt>
@@ -7137,7 +8094,7 @@
           </w:r>
           <w:r>
             <w:rPr>
-              <w:lang w:val="fr-CA"/>
+              <w:lang w:val="en-US"/>
             </w:rPr>
             <w:instrText xml:space="preserve"> CITATION Art \l 3084 </w:instrText>
           </w:r>
@@ -7147,7 +8104,7 @@
           <w:r>
             <w:rPr>
               <w:noProof/>
-              <w:lang w:val="fr-CA"/>
+              <w:lang w:val="en-US"/>
             </w:rPr>
             <w:t>(Gurnov, s.d.)</w:t>
           </w:r>
@@ -8555,11 +9512,11 @@
     <w:name w:val="Normal"/>
     <w:qFormat/>
   </w:style>
-  <w:style w:type="paragraph" w:styleId="Heading1">
+  <w:style w:type="paragraph" w:styleId="Titre1">
     <w:name w:val="heading 1"/>
     <w:basedOn w:val="Normal"/>
     <w:next w:val="Normal"/>
-    <w:link w:val="Heading1Char"/>
+    <w:link w:val="Titre1Car"/>
     <w:uiPriority w:val="9"/>
     <w:qFormat/>
     <w:rsid w:val="00AE6F8F"/>
@@ -8576,11 +9533,11 @@
       <w:szCs w:val="32"/>
     </w:rPr>
   </w:style>
-  <w:style w:type="paragraph" w:styleId="Heading2">
+  <w:style w:type="paragraph" w:styleId="Titre2">
     <w:name w:val="heading 2"/>
     <w:basedOn w:val="Normal"/>
     <w:next w:val="Normal"/>
-    <w:link w:val="Heading2Char"/>
+    <w:link w:val="Titre2Car"/>
     <w:uiPriority w:val="9"/>
     <w:unhideWhenUsed/>
     <w:qFormat/>
@@ -8598,11 +9555,11 @@
       <w:szCs w:val="26"/>
     </w:rPr>
   </w:style>
-  <w:style w:type="paragraph" w:styleId="Heading3">
+  <w:style w:type="paragraph" w:styleId="Titre3">
     <w:name w:val="heading 3"/>
     <w:basedOn w:val="Normal"/>
     <w:next w:val="Normal"/>
-    <w:link w:val="Heading3Char"/>
+    <w:link w:val="Titre3Car"/>
     <w:uiPriority w:val="9"/>
     <w:unhideWhenUsed/>
     <w:qFormat/>
@@ -8618,13 +9575,12 @@
       <w:color w:val="1F4D78" w:themeColor="accent1" w:themeShade="7F"/>
     </w:rPr>
   </w:style>
-  <w:style w:type="character" w:default="1" w:styleId="DefaultParagraphFont">
+  <w:style w:type="character" w:default="1" w:styleId="Policepardfaut">
     <w:name w:val="Default Paragraph Font"/>
     <w:uiPriority w:val="1"/>
-    <w:semiHidden/>
     <w:unhideWhenUsed/>
   </w:style>
-  <w:style w:type="table" w:default="1" w:styleId="TableNormal">
+  <w:style w:type="table" w:default="1" w:styleId="TableauNormal">
     <w:name w:val="Normal Table"/>
     <w:uiPriority w:val="99"/>
     <w:semiHidden/>
@@ -8639,16 +9595,16 @@
       </w:tblCellMar>
     </w:tblPr>
   </w:style>
-  <w:style w:type="numbering" w:default="1" w:styleId="NoList">
+  <w:style w:type="numbering" w:default="1" w:styleId="Aucuneliste">
     <w:name w:val="No List"/>
     <w:uiPriority w:val="99"/>
     <w:semiHidden/>
     <w:unhideWhenUsed/>
   </w:style>
-  <w:style w:type="character" w:customStyle="1" w:styleId="Heading1Char">
-    <w:name w:val="Heading 1 Char"/>
-    <w:basedOn w:val="DefaultParagraphFont"/>
-    <w:link w:val="Heading1"/>
+  <w:style w:type="character" w:customStyle="1" w:styleId="Titre1Car">
+    <w:name w:val="Titre 1 Car"/>
+    <w:basedOn w:val="Policepardfaut"/>
+    <w:link w:val="Titre1"/>
     <w:uiPriority w:val="9"/>
     <w:rsid w:val="00AE6F8F"/>
     <w:rPr>
@@ -8658,10 +9614,10 @@
       <w:szCs w:val="32"/>
     </w:rPr>
   </w:style>
-  <w:style w:type="character" w:customStyle="1" w:styleId="Heading2Char">
-    <w:name w:val="Heading 2 Char"/>
-    <w:basedOn w:val="DefaultParagraphFont"/>
-    <w:link w:val="Heading2"/>
+  <w:style w:type="character" w:customStyle="1" w:styleId="Titre2Car">
+    <w:name w:val="Titre 2 Car"/>
+    <w:basedOn w:val="Policepardfaut"/>
+    <w:link w:val="Titre2"/>
     <w:uiPriority w:val="9"/>
     <w:rsid w:val="004D7F3D"/>
     <w:rPr>
@@ -8671,9 +9627,9 @@
       <w:szCs w:val="26"/>
     </w:rPr>
   </w:style>
-  <w:style w:type="paragraph" w:styleId="NoSpacing">
+  <w:style w:type="paragraph" w:styleId="Sansinterligne">
     <w:name w:val="No Spacing"/>
-    <w:link w:val="NoSpacingChar"/>
+    <w:link w:val="SansinterligneCar"/>
     <w:uiPriority w:val="1"/>
     <w:qFormat/>
     <w:rsid w:val="004F1D27"/>
@@ -8683,10 +9639,10 @@
       <w:lang w:val="en-US" w:eastAsia="zh-CN"/>
     </w:rPr>
   </w:style>
-  <w:style w:type="character" w:customStyle="1" w:styleId="NoSpacingChar">
-    <w:name w:val="No Spacing Char"/>
-    <w:basedOn w:val="DefaultParagraphFont"/>
-    <w:link w:val="NoSpacing"/>
+  <w:style w:type="character" w:customStyle="1" w:styleId="SansinterligneCar">
+    <w:name w:val="Sans interligne Car"/>
+    <w:basedOn w:val="Policepardfaut"/>
+    <w:link w:val="Sansinterligne"/>
     <w:uiPriority w:val="1"/>
     <w:rsid w:val="004F1D27"/>
     <w:rPr>
@@ -8695,16 +9651,16 @@
       <w:lang w:val="en-US" w:eastAsia="zh-CN"/>
     </w:rPr>
   </w:style>
-  <w:style w:type="paragraph" w:styleId="Revision">
+  <w:style w:type="paragraph" w:styleId="Rvision">
     <w:name w:val="Revision"/>
     <w:hidden/>
     <w:uiPriority w:val="99"/>
     <w:semiHidden/>
     <w:rsid w:val="004F1D27"/>
   </w:style>
-  <w:style w:type="paragraph" w:styleId="TOCHeading">
+  <w:style w:type="paragraph" w:styleId="En-ttedetabledesmatires">
     <w:name w:val="TOC Heading"/>
-    <w:basedOn w:val="Heading1"/>
+    <w:basedOn w:val="Titre1"/>
     <w:next w:val="Normal"/>
     <w:uiPriority w:val="39"/>
     <w:unhideWhenUsed/>
@@ -8721,7 +9677,7 @@
       <w:szCs w:val="28"/>
     </w:rPr>
   </w:style>
-  <w:style w:type="paragraph" w:styleId="TOC1">
+  <w:style w:type="paragraph" w:styleId="TM1">
     <w:name w:val="toc 1"/>
     <w:basedOn w:val="Normal"/>
     <w:next w:val="Normal"/>
@@ -8741,9 +9697,9 @@
       <w:u w:val="single"/>
     </w:rPr>
   </w:style>
-  <w:style w:type="character" w:styleId="Hyperlink">
+  <w:style w:type="character" w:styleId="Hyperlien">
     <w:name w:val="Hyperlink"/>
-    <w:basedOn w:val="DefaultParagraphFont"/>
+    <w:basedOn w:val="Policepardfaut"/>
     <w:uiPriority w:val="99"/>
     <w:unhideWhenUsed/>
     <w:rsid w:val="00AE6F8F"/>
@@ -8752,7 +9708,7 @@
       <w:u w:val="single"/>
     </w:rPr>
   </w:style>
-  <w:style w:type="paragraph" w:styleId="TOC2">
+  <w:style w:type="paragraph" w:styleId="TM2">
     <w:name w:val="toc 2"/>
     <w:basedOn w:val="Normal"/>
     <w:next w:val="Normal"/>
@@ -8768,7 +9724,7 @@
       <w:szCs w:val="22"/>
     </w:rPr>
   </w:style>
-  <w:style w:type="paragraph" w:styleId="TOC3">
+  <w:style w:type="paragraph" w:styleId="TM3">
     <w:name w:val="toc 3"/>
     <w:basedOn w:val="Normal"/>
     <w:next w:val="Normal"/>
@@ -8782,7 +9738,7 @@
       <w:szCs w:val="22"/>
     </w:rPr>
   </w:style>
-  <w:style w:type="paragraph" w:styleId="TOC4">
+  <w:style w:type="paragraph" w:styleId="TM4">
     <w:name w:val="toc 4"/>
     <w:basedOn w:val="Normal"/>
     <w:next w:val="Normal"/>
@@ -8796,7 +9752,7 @@
       <w:szCs w:val="22"/>
     </w:rPr>
   </w:style>
-  <w:style w:type="paragraph" w:styleId="TOC5">
+  <w:style w:type="paragraph" w:styleId="TM5">
     <w:name w:val="toc 5"/>
     <w:basedOn w:val="Normal"/>
     <w:next w:val="Normal"/>
@@ -8810,7 +9766,7 @@
       <w:szCs w:val="22"/>
     </w:rPr>
   </w:style>
-  <w:style w:type="paragraph" w:styleId="TOC6">
+  <w:style w:type="paragraph" w:styleId="TM6">
     <w:name w:val="toc 6"/>
     <w:basedOn w:val="Normal"/>
     <w:next w:val="Normal"/>
@@ -8824,7 +9780,7 @@
       <w:szCs w:val="22"/>
     </w:rPr>
   </w:style>
-  <w:style w:type="paragraph" w:styleId="TOC7">
+  <w:style w:type="paragraph" w:styleId="TM7">
     <w:name w:val="toc 7"/>
     <w:basedOn w:val="Normal"/>
     <w:next w:val="Normal"/>
@@ -8838,7 +9794,7 @@
       <w:szCs w:val="22"/>
     </w:rPr>
   </w:style>
-  <w:style w:type="paragraph" w:styleId="TOC8">
+  <w:style w:type="paragraph" w:styleId="TM8">
     <w:name w:val="toc 8"/>
     <w:basedOn w:val="Normal"/>
     <w:next w:val="Normal"/>
@@ -8852,7 +9808,7 @@
       <w:szCs w:val="22"/>
     </w:rPr>
   </w:style>
-  <w:style w:type="paragraph" w:styleId="TOC9">
+  <w:style w:type="paragraph" w:styleId="TM9">
     <w:name w:val="toc 9"/>
     <w:basedOn w:val="Normal"/>
     <w:next w:val="Normal"/>
@@ -8866,7 +9822,7 @@
       <w:szCs w:val="22"/>
     </w:rPr>
   </w:style>
-  <w:style w:type="paragraph" w:styleId="ListParagraph">
+  <w:style w:type="paragraph" w:styleId="Paragraphedeliste">
     <w:name w:val="List Paragraph"/>
     <w:basedOn w:val="Normal"/>
     <w:uiPriority w:val="34"/>
@@ -8877,10 +9833,10 @@
       <w:contextualSpacing/>
     </w:pPr>
   </w:style>
-  <w:style w:type="paragraph" w:styleId="Footer">
+  <w:style w:type="paragraph" w:styleId="Pieddepage">
     <w:name w:val="footer"/>
     <w:basedOn w:val="Normal"/>
-    <w:link w:val="FooterChar"/>
+    <w:link w:val="PieddepageCar"/>
     <w:uiPriority w:val="99"/>
     <w:unhideWhenUsed/>
     <w:rsid w:val="00112001"/>
@@ -8891,25 +9847,25 @@
       </w:tabs>
     </w:pPr>
   </w:style>
-  <w:style w:type="character" w:customStyle="1" w:styleId="FooterChar">
-    <w:name w:val="Footer Char"/>
-    <w:basedOn w:val="DefaultParagraphFont"/>
-    <w:link w:val="Footer"/>
+  <w:style w:type="character" w:customStyle="1" w:styleId="PieddepageCar">
+    <w:name w:val="Pied de page Car"/>
+    <w:basedOn w:val="Policepardfaut"/>
+    <w:link w:val="Pieddepage"/>
     <w:uiPriority w:val="99"/>
     <w:rsid w:val="00112001"/>
   </w:style>
-  <w:style w:type="character" w:styleId="PageNumber">
+  <w:style w:type="character" w:styleId="Numrodepage">
     <w:name w:val="page number"/>
-    <w:basedOn w:val="DefaultParagraphFont"/>
+    <w:basedOn w:val="Policepardfaut"/>
     <w:uiPriority w:val="99"/>
     <w:semiHidden/>
     <w:unhideWhenUsed/>
     <w:rsid w:val="00112001"/>
   </w:style>
-  <w:style w:type="paragraph" w:styleId="Header">
+  <w:style w:type="paragraph" w:styleId="En-tte">
     <w:name w:val="header"/>
     <w:basedOn w:val="Normal"/>
-    <w:link w:val="HeaderChar"/>
+    <w:link w:val="En-tteCar"/>
     <w:uiPriority w:val="99"/>
     <w:unhideWhenUsed/>
     <w:rsid w:val="00112001"/>
@@ -8920,14 +9876,14 @@
       </w:tabs>
     </w:pPr>
   </w:style>
-  <w:style w:type="character" w:customStyle="1" w:styleId="HeaderChar">
-    <w:name w:val="Header Char"/>
-    <w:basedOn w:val="DefaultParagraphFont"/>
-    <w:link w:val="Header"/>
+  <w:style w:type="character" w:customStyle="1" w:styleId="En-tteCar">
+    <w:name w:val="En-tête Car"/>
+    <w:basedOn w:val="Policepardfaut"/>
+    <w:link w:val="En-tte"/>
     <w:uiPriority w:val="99"/>
     <w:rsid w:val="00112001"/>
   </w:style>
-  <w:style w:type="paragraph" w:styleId="Caption">
+  <w:style w:type="paragraph" w:styleId="Lgende">
     <w:name w:val="caption"/>
     <w:basedOn w:val="Normal"/>
     <w:next w:val="Normal"/>
@@ -8946,10 +9902,10 @@
       <w:szCs w:val="18"/>
     </w:rPr>
   </w:style>
-  <w:style w:type="paragraph" w:styleId="BalloonText">
+  <w:style w:type="paragraph" w:styleId="Textedebulles">
     <w:name w:val="Balloon Text"/>
     <w:basedOn w:val="Normal"/>
-    <w:link w:val="BalloonTextChar"/>
+    <w:link w:val="TextedebullesCar"/>
     <w:uiPriority w:val="99"/>
     <w:semiHidden/>
     <w:unhideWhenUsed/>
@@ -8960,10 +9916,10 @@
       <w:szCs w:val="18"/>
     </w:rPr>
   </w:style>
-  <w:style w:type="character" w:customStyle="1" w:styleId="BalloonTextChar">
-    <w:name w:val="Balloon Text Char"/>
-    <w:basedOn w:val="DefaultParagraphFont"/>
-    <w:link w:val="BalloonText"/>
+  <w:style w:type="character" w:customStyle="1" w:styleId="TextedebullesCar">
+    <w:name w:val="Texte de bulles Car"/>
+    <w:basedOn w:val="Policepardfaut"/>
+    <w:link w:val="Textedebulles"/>
     <w:uiPriority w:val="99"/>
     <w:semiHidden/>
     <w:rsid w:val="00684C08"/>
@@ -8973,9 +9929,9 @@
       <w:szCs w:val="18"/>
     </w:rPr>
   </w:style>
-  <w:style w:type="table" w:styleId="TableGrid">
+  <w:style w:type="table" w:styleId="Grilledutableau">
     <w:name w:val="Table Grid"/>
-    <w:basedOn w:val="TableNormal"/>
+    <w:basedOn w:val="TableauNormal"/>
     <w:uiPriority w:val="39"/>
     <w:rsid w:val="002F4A84"/>
     <w:tblPr>
@@ -8989,9 +9945,9 @@
       </w:tblBorders>
     </w:tblPr>
   </w:style>
-  <w:style w:type="table" w:styleId="GridTable1Light-Accent1">
+  <w:style w:type="table" w:styleId="TableauGrille1clair-Accentuation1">
     <w:name w:val="Grid Table 1 Light Accent 1"/>
-    <w:basedOn w:val="TableNormal"/>
+    <w:basedOn w:val="TableauNormal"/>
     <w:uiPriority w:val="46"/>
     <w:rsid w:val="002F4A84"/>
     <w:tblPr>
@@ -9043,9 +9999,9 @@
       </w:rPr>
     </w:tblStylePr>
   </w:style>
-  <w:style w:type="table" w:styleId="GridTable4-Accent5">
+  <w:style w:type="table" w:styleId="TableauGrille4-Accentuation5">
     <w:name w:val="Grid Table 4 Accent 5"/>
-    <w:basedOn w:val="TableNormal"/>
+    <w:basedOn w:val="TableauNormal"/>
     <w:uiPriority w:val="49"/>
     <w:rsid w:val="002F4A84"/>
     <w:tblPr>
@@ -9116,24 +10072,24 @@
       </w:tcPr>
     </w:tblStylePr>
   </w:style>
-  <w:style w:type="paragraph" w:styleId="FootnoteText">
+  <w:style w:type="paragraph" w:styleId="Notedebasdepage">
     <w:name w:val="footnote text"/>
     <w:basedOn w:val="Normal"/>
-    <w:link w:val="FootnoteTextChar"/>
+    <w:link w:val="NotedebasdepageCar"/>
     <w:uiPriority w:val="99"/>
     <w:unhideWhenUsed/>
     <w:rsid w:val="005C3BD9"/>
   </w:style>
-  <w:style w:type="character" w:customStyle="1" w:styleId="FootnoteTextChar">
-    <w:name w:val="Footnote Text Char"/>
-    <w:basedOn w:val="DefaultParagraphFont"/>
-    <w:link w:val="FootnoteText"/>
+  <w:style w:type="character" w:customStyle="1" w:styleId="NotedebasdepageCar">
+    <w:name w:val="Note de bas de page Car"/>
+    <w:basedOn w:val="Policepardfaut"/>
+    <w:link w:val="Notedebasdepage"/>
     <w:uiPriority w:val="99"/>
     <w:rsid w:val="005C3BD9"/>
   </w:style>
-  <w:style w:type="character" w:styleId="FootnoteReference">
+  <w:style w:type="character" w:styleId="Appelnotedebasdep">
     <w:name w:val="footnote reference"/>
-    <w:basedOn w:val="DefaultParagraphFont"/>
+    <w:basedOn w:val="Policepardfaut"/>
     <w:uiPriority w:val="99"/>
     <w:unhideWhenUsed/>
     <w:rsid w:val="005C3BD9"/>
@@ -9141,9 +10097,9 @@
       <w:vertAlign w:val="superscript"/>
     </w:rPr>
   </w:style>
-  <w:style w:type="table" w:styleId="GridTable5Dark-Accent5">
+  <w:style w:type="table" w:styleId="TableauGrille5Fonc-Accentuation5">
     <w:name w:val="Grid Table 5 Dark Accent 5"/>
-    <w:basedOn w:val="TableNormal"/>
+    <w:basedOn w:val="TableauNormal"/>
     <w:uiPriority w:val="50"/>
     <w:rsid w:val="00BD53B0"/>
     <w:tblPr>
@@ -9244,9 +10200,9 @@
       </w:tcPr>
     </w:tblStylePr>
   </w:style>
-  <w:style w:type="character" w:styleId="PlaceholderText">
+  <w:style w:type="character" w:styleId="Textedelespacerserv">
     <w:name w:val="Placeholder Text"/>
-    <w:basedOn w:val="DefaultParagraphFont"/>
+    <w:basedOn w:val="Policepardfaut"/>
     <w:uiPriority w:val="99"/>
     <w:semiHidden/>
     <w:rsid w:val="00E32E72"/>
@@ -9254,10 +10210,10 @@
       <w:color w:val="808080"/>
     </w:rPr>
   </w:style>
-  <w:style w:type="character" w:customStyle="1" w:styleId="Heading3Char">
-    <w:name w:val="Heading 3 Char"/>
-    <w:basedOn w:val="DefaultParagraphFont"/>
-    <w:link w:val="Heading3"/>
+  <w:style w:type="character" w:customStyle="1" w:styleId="Titre3Car">
+    <w:name w:val="Titre 3 Car"/>
+    <w:basedOn w:val="Policepardfaut"/>
+    <w:link w:val="Titre3"/>
     <w:uiPriority w:val="9"/>
     <w:rsid w:val="00280A4A"/>
     <w:rPr>
@@ -9265,9 +10221,9 @@
       <w:color w:val="1F4D78" w:themeColor="accent1" w:themeShade="7F"/>
     </w:rPr>
   </w:style>
-  <w:style w:type="character" w:styleId="CommentReference">
+  <w:style w:type="character" w:styleId="Marquedecommentaire">
     <w:name w:val="annotation reference"/>
-    <w:basedOn w:val="DefaultParagraphFont"/>
+    <w:basedOn w:val="Policepardfaut"/>
     <w:uiPriority w:val="99"/>
     <w:semiHidden/>
     <w:unhideWhenUsed/>
@@ -9277,10 +10233,10 @@
       <w:szCs w:val="16"/>
     </w:rPr>
   </w:style>
-  <w:style w:type="paragraph" w:styleId="CommentText">
+  <w:style w:type="paragraph" w:styleId="Commentaire">
     <w:name w:val="annotation text"/>
     <w:basedOn w:val="Normal"/>
-    <w:link w:val="CommentTextChar"/>
+    <w:link w:val="CommentaireCar"/>
     <w:uiPriority w:val="99"/>
     <w:semiHidden/>
     <w:unhideWhenUsed/>
@@ -9290,10 +10246,10 @@
       <w:szCs w:val="20"/>
     </w:rPr>
   </w:style>
-  <w:style w:type="character" w:customStyle="1" w:styleId="CommentTextChar">
-    <w:name w:val="Comment Text Char"/>
-    <w:basedOn w:val="DefaultParagraphFont"/>
-    <w:link w:val="CommentText"/>
+  <w:style w:type="character" w:customStyle="1" w:styleId="CommentaireCar">
+    <w:name w:val="Commentaire Car"/>
+    <w:basedOn w:val="Policepardfaut"/>
+    <w:link w:val="Commentaire"/>
     <w:uiPriority w:val="99"/>
     <w:semiHidden/>
     <w:rsid w:val="00591699"/>
@@ -9302,11 +10258,11 @@
       <w:szCs w:val="20"/>
     </w:rPr>
   </w:style>
-  <w:style w:type="paragraph" w:styleId="CommentSubject">
+  <w:style w:type="paragraph" w:styleId="Objetducommentaire">
     <w:name w:val="annotation subject"/>
-    <w:basedOn w:val="CommentText"/>
-    <w:next w:val="CommentText"/>
-    <w:link w:val="CommentSubjectChar"/>
+    <w:basedOn w:val="Commentaire"/>
+    <w:next w:val="Commentaire"/>
+    <w:link w:val="ObjetducommentaireCar"/>
     <w:uiPriority w:val="99"/>
     <w:semiHidden/>
     <w:unhideWhenUsed/>
@@ -9316,10 +10272,10 @@
       <w:bCs/>
     </w:rPr>
   </w:style>
-  <w:style w:type="character" w:customStyle="1" w:styleId="CommentSubjectChar">
-    <w:name w:val="Comment Subject Char"/>
-    <w:basedOn w:val="CommentTextChar"/>
-    <w:link w:val="CommentSubject"/>
+  <w:style w:type="character" w:customStyle="1" w:styleId="ObjetducommentaireCar">
+    <w:name w:val="Objet du commentaire Car"/>
+    <w:basedOn w:val="CommentaireCar"/>
+    <w:link w:val="Objetducommentaire"/>
     <w:uiPriority w:val="99"/>
     <w:semiHidden/>
     <w:rsid w:val="00591699"/>
@@ -9330,13 +10286,25 @@
       <w:szCs w:val="20"/>
     </w:rPr>
   </w:style>
-  <w:style w:type="paragraph" w:styleId="Bibliography">
+  <w:style w:type="paragraph" w:styleId="Bibliographie">
     <w:name w:val="Bibliography"/>
     <w:basedOn w:val="Normal"/>
     <w:next w:val="Normal"/>
     <w:uiPriority w:val="37"/>
     <w:unhideWhenUsed/>
     <w:rsid w:val="00591699"/>
+  </w:style>
+  <w:style w:type="character" w:styleId="Mentionnonrsolue">
+    <w:name w:val="Unresolved Mention"/>
+    <w:basedOn w:val="Policepardfaut"/>
+    <w:uiPriority w:val="99"/>
+    <w:semiHidden/>
+    <w:unhideWhenUsed/>
+    <w:rsid w:val="008F625D"/>
+    <w:rPr>
+      <w:color w:val="605E5C"/>
+      <w:shd w:val="clear" w:color="auto" w:fill="E1DFDD"/>
+    </w:rPr>
   </w:style>
 </w:styles>
 </file>
@@ -9623,48 +10591,6 @@
 </file>
 
 <file path=customXml/item3.xml><?xml version="1.0" encoding="utf-8"?>
-<b:Sources xmlns:b="http://schemas.openxmlformats.org/officeDocument/2006/bibliography" xmlns="http://schemas.openxmlformats.org/officeDocument/2006/bibliography" SelectedStyle="/APASixthEditionOfficeOnline.xsl" StyleName="APA">
-  <b:Source>
-    <b:Tag>Vis</b:Tag>
-    <b:SourceType>InternetSite</b:SourceType>
-    <b:Guid>{B9C70EF5-BAFC-40B3-9F24-BC265BF6B0E2}</b:Guid>
-    <b:Author>
-      <b:Author>
-        <b:NameList>
-          <b:Person>
-            <b:Last>Visure</b:Last>
-          </b:Person>
-        </b:NameList>
-      </b:Author>
-    </b:Author>
-    <b:Title>Quelles sont les exigences fonctionnelles : exemples et modèles</b:Title>
-    <b:InternetSiteTitle>Visure</b:InternetSiteTitle>
-    <b:URL>https://visuresolutions.com/fr/alm-guide/functional-requirements/</b:URL>
-    <b:RefOrder>1</b:RefOrder>
-  </b:Source>
-  <b:Source>
-    <b:Tag>Art</b:Tag>
-    <b:SourceType>InternetSite</b:SourceType>
-    <b:Guid>{1B2E701E-DE09-4CCA-8D3F-35B556E74327}</b:Guid>
-    <b:Author>
-      <b:Author>
-        <b:NameList>
-          <b:Person>
-            <b:Last>Gurnov</b:Last>
-            <b:First>Artem</b:First>
-          </b:Person>
-        </b:NameList>
-      </b:Author>
-    </b:Author>
-    <b:Title>Qu'est-ce que la portée en gestion de projet ?</b:Title>
-    <b:InternetSiteTitle>Wrike</b:InternetSiteTitle>
-    <b:URL>https://www.wrike.com/fr/project-management-guide/faq/quest-ce-que-la-portee-en-gestion-de-projet/</b:URL>
-    <b:RefOrder>2</b:RefOrder>
-  </b:Source>
-</b:Sources>
-</file>
-
-<file path=customXml/item4.xml><?xml version="1.0" encoding="utf-8"?>
 <p:properties xmlns:p="http://schemas.microsoft.com/office/2006/metadata/properties" xmlns:xsi="http://www.w3.org/2001/XMLSchema-instance" xmlns:pc="http://schemas.microsoft.com/office/infopath/2007/PartnerControls">
   <documentManagement>
     <_activity xmlns="6c21063f-3251-4c20-8fa9-daec1aa44631" xsi:nil="true"/>
@@ -9672,7 +10598,7 @@
 </p:properties>
 </file>
 
-<file path=customXml/item5.xml><?xml version="1.0" encoding="utf-8"?>
+<file path=customXml/item4.xml><?xml version="1.0" encoding="utf-8"?>
 <ct:contentTypeSchema xmlns:ct="http://schemas.microsoft.com/office/2006/metadata/contentType" xmlns:ma="http://schemas.microsoft.com/office/2006/metadata/properties/metaAttributes" ct:_="" ma:_="" ma:contentTypeName="Document" ma:contentTypeID="0x010100DD1BDA3635D0CE4294F1538A5593EE62" ma:contentTypeVersion="6" ma:contentTypeDescription="Crée un document." ma:contentTypeScope="" ma:versionID="7d8312884f8fef95f6d9b9043714d214">
   <xsd:schema xmlns:xsd="http://www.w3.org/2001/XMLSchema" xmlns:xs="http://www.w3.org/2001/XMLSchema" xmlns:p="http://schemas.microsoft.com/office/2006/metadata/properties" xmlns:ns3="6c21063f-3251-4c20-8fa9-daec1aa44631" targetNamespace="http://schemas.microsoft.com/office/2006/metadata/properties" ma:root="true" ma:fieldsID="768983979da287311b5c276d889ebb4f" ns3:_="">
     <xsd:import namespace="6c21063f-3251-4c20-8fa9-daec1aa44631"/>
@@ -9828,6 +10754,48 @@
 </ct:contentTypeSchema>
 </file>
 
+<file path=customXml/item5.xml><?xml version="1.0" encoding="utf-8"?>
+<b:Sources xmlns:b="http://schemas.openxmlformats.org/officeDocument/2006/bibliography" xmlns="http://schemas.openxmlformats.org/officeDocument/2006/bibliography" SelectedStyle="\APASixthEditionOfficeOnline.xsl" StyleName="APA" Version="6">
+  <b:Source>
+    <b:Tag>Art</b:Tag>
+    <b:SourceType>InternetSite</b:SourceType>
+    <b:Guid>{1B2E701E-DE09-4CCA-8D3F-35B556E74327}</b:Guid>
+    <b:Author>
+      <b:Author>
+        <b:NameList>
+          <b:Person>
+            <b:Last>Gurnov</b:Last>
+            <b:First>Artem</b:First>
+          </b:Person>
+        </b:NameList>
+      </b:Author>
+    </b:Author>
+    <b:Title>Qu'est-ce que la portée en gestion de projet ?</b:Title>
+    <b:InternetSiteTitle>Wrike</b:InternetSiteTitle>
+    <b:URL>https://www.wrike.com/fr/project-management-guide/faq/quest-ce-que-la-portee-en-gestion-de-projet/</b:URL>
+    <b:RefOrder>1</b:RefOrder>
+  </b:Source>
+  <b:Source>
+    <b:Tag>Visure</b:Tag>
+    <b:SourceType>InternetSite</b:SourceType>
+    <b:Guid>{B4EE9BE7-6D0A-44FD-B459-B25ADC973935}</b:Guid>
+    <b:Author>
+      <b:Author>
+        <b:NameList>
+          <b:Person>
+            <b:Last>Visure</b:Last>
+          </b:Person>
+        </b:NameList>
+      </b:Author>
+    </b:Author>
+    <b:Title>Exigences fonctionnelles et non fonctionnelles (avec exemples)</b:Title>
+    <b:InternetSiteTitle>Visure</b:InternetSiteTitle>
+    <b:URL>https://visuresolutions.com/fr/guide-d%27alm/exigences-fonctionnelles-vs-non-fonctionnelles/</b:URL>
+    <b:RefOrder>2</b:RefOrder>
+  </b:Source>
+</b:Sources>
+</file>
+
 <file path=customXml/itemProps1.xml><?xml version="1.0" encoding="utf-8"?>
 <ds:datastoreItem xmlns:ds="http://schemas.openxmlformats.org/officeDocument/2006/customXml" ds:itemID="{55AF091B-3C7A-41E3-B477-F2FDAA23CFDA}">
   <ds:schemaRefs>
@@ -9845,14 +10813,6 @@
 </file>
 
 <file path=customXml/itemProps3.xml><?xml version="1.0" encoding="utf-8"?>
-<ds:datastoreItem xmlns:ds="http://schemas.openxmlformats.org/officeDocument/2006/customXml" ds:itemID="{93500BA5-348A-4991-AA91-E04527A8A74E}">
-  <ds:schemaRefs>
-    <ds:schemaRef ds:uri="http://schemas.openxmlformats.org/officeDocument/2006/bibliography"/>
-  </ds:schemaRefs>
-</ds:datastoreItem>
-</file>
-
-<file path=customXml/itemProps4.xml><?xml version="1.0" encoding="utf-8"?>
 <ds:datastoreItem xmlns:ds="http://schemas.openxmlformats.org/officeDocument/2006/customXml" ds:itemID="{EFD434DE-B9B6-4C70-9FE4-63E118A3A70B}">
   <ds:schemaRefs>
     <ds:schemaRef ds:uri="http://schemas.microsoft.com/office/2006/metadata/properties"/>
@@ -9862,7 +10822,7 @@
 </ds:datastoreItem>
 </file>
 
-<file path=customXml/itemProps5.xml><?xml version="1.0" encoding="utf-8"?>
+<file path=customXml/itemProps4.xml><?xml version="1.0" encoding="utf-8"?>
 <ds:datastoreItem xmlns:ds="http://schemas.openxmlformats.org/officeDocument/2006/customXml" ds:itemID="{DABF9DF8-0D5C-48D0-B96A-D802F81EE6C3}">
   <ds:schemaRefs>
     <ds:schemaRef ds:uri="http://schemas.microsoft.com/office/2006/metadata/contentType"/>
@@ -9878,4 +10838,12 @@
     <ds:schemaRef ds:uri="http://schemas.microsoft.com/internal/obd"/>
   </ds:schemaRefs>
 </ds:datastoreItem>
+</file>
+
+<file path=customXml/itemProps5.xml><?xml version="1.0" encoding="utf-8"?>
+<ds:datastoreItem xmlns:ds="http://schemas.openxmlformats.org/officeDocument/2006/customXml" ds:itemID="{5C400838-C14A-4DEC-8BE1-42D31317F1FE}">
+  <ds:schemaRefs>
+    <ds:schemaRef ds:uri="http://schemas.openxmlformats.org/officeDocument/2006/bibliography"/>
+  </ds:schemaRefs>
+</ds:datastoreItem>
 </file>
</xml_diff>